<commit_message>
de cabeza al indice
</commit_message>
<xml_diff>
--- a/DOCS/2024 10 23 -- Plantilla Memoria Proyecto (1).docx
+++ b/DOCS/2024 10 23 -- Plantilla Memoria Proyecto (1).docx
@@ -307,7 +307,7 @@
               <w:txbxContent>
                 <w:tbl>
                   <w:tblPr>
-                    <w:tblStyle w:val="Tablaconcuadrcula"/>
+                    <w:tblStyle w:val="TableGrid"/>
                     <w:tblW w:w="10343" w:type="dxa"/>
                     <w:tblBorders>
                       <w:top w:val="single" w:sz="8" w:space="0" w:color="F8F8F8" w:themeColor="background2"/>
@@ -814,7 +814,7 @@
     </w:p>
     <w:p>
       <w:pPr>
-        <w:pStyle w:val="Ttulo"/>
+        <w:pStyle w:val="Title"/>
         <w:rPr>
           <w:rFonts w:ascii="Tahoma" w:hAnsi="Tahoma" w:cs="Tahoma"/>
           <w:i/>
@@ -927,7 +927,7 @@
     </w:p>
     <w:p>
       <w:pPr>
-        <w:pStyle w:val="Ttulo"/>
+        <w:pStyle w:val="Title"/>
         <w:rPr>
           <w:rFonts w:ascii="Tahoma" w:hAnsi="Tahoma" w:cs="Tahoma"/>
           <w:sz w:val="40"/>
@@ -1230,7 +1230,7 @@
     </w:p>
     <w:p>
       <w:pPr>
-        <w:pStyle w:val="Ttulo"/>
+        <w:pStyle w:val="Title"/>
         <w:rPr>
           <w:rFonts w:ascii="Tahoma" w:hAnsi="Tahoma" w:cs="Tahoma"/>
           <w:i/>
@@ -1404,7 +1404,7 @@
     </w:p>
     <w:p>
       <w:pPr>
-        <w:pStyle w:val="Ttulo"/>
+        <w:pStyle w:val="Title"/>
         <w:rPr>
           <w:rFonts w:ascii="Tahoma" w:hAnsi="Tahoma" w:cs="Tahoma"/>
           <w:sz w:val="40"/>
@@ -1423,7 +1423,7 @@
     </w:p>
     <w:p>
       <w:pPr>
-        <w:pStyle w:val="TDC1"/>
+        <w:pStyle w:val="TOC1"/>
         <w:tabs>
           <w:tab w:val="left" w:pos="1540"/>
           <w:tab w:val="right" w:leader="dot" w:pos="8494"/>
@@ -1465,7 +1465,7 @@
       <w:hyperlink w:anchor="_Toc180586128" w:history="1">
         <w:r>
           <w:rPr>
-            <w:rStyle w:val="Hipervnculo"/>
+            <w:rStyle w:val="Hyperlink"/>
             <w:rFonts w:ascii="Tahoma" w:hAnsi="Tahoma" w:cs="Tahoma"/>
             <w:noProof/>
           </w:rPr>
@@ -1488,7 +1488,7 @@
         </w:r>
         <w:r>
           <w:rPr>
-            <w:rStyle w:val="Hipervnculo"/>
+            <w:rStyle w:val="Hyperlink"/>
             <w:rFonts w:ascii="Tahoma" w:hAnsi="Tahoma" w:cs="Tahoma"/>
             <w:noProof/>
           </w:rPr>
@@ -1546,7 +1546,7 @@
     </w:p>
     <w:p>
       <w:pPr>
-        <w:pStyle w:val="TDC2"/>
+        <w:pStyle w:val="TOC2"/>
         <w:rPr>
           <w:rFonts w:eastAsiaTheme="minorEastAsia"/>
           <w:smallCaps w:val="0"/>
@@ -1561,7 +1561,7 @@
       <w:hyperlink w:anchor="_Toc180586129" w:history="1">
         <w:r>
           <w:rPr>
-            <w:rStyle w:val="Hipervnculo"/>
+            <w:rStyle w:val="Hyperlink"/>
             <w:rFonts w:ascii="Tahoma" w:hAnsi="Tahoma" w:cs="Tahoma"/>
             <w:noProof/>
           </w:rPr>
@@ -1582,7 +1582,7 @@
         </w:r>
         <w:r>
           <w:rPr>
-            <w:rStyle w:val="Hipervnculo"/>
+            <w:rStyle w:val="Hyperlink"/>
             <w:rFonts w:ascii="Tahoma" w:hAnsi="Tahoma" w:cs="Tahoma"/>
             <w:noProof/>
           </w:rPr>
@@ -1640,7 +1640,7 @@
     </w:p>
     <w:p>
       <w:pPr>
-        <w:pStyle w:val="TDC2"/>
+        <w:pStyle w:val="TOC2"/>
         <w:rPr>
           <w:rFonts w:eastAsiaTheme="minorEastAsia"/>
           <w:smallCaps w:val="0"/>
@@ -1655,7 +1655,7 @@
       <w:hyperlink w:anchor="_Toc180586130" w:history="1">
         <w:r>
           <w:rPr>
-            <w:rStyle w:val="Hipervnculo"/>
+            <w:rStyle w:val="Hyperlink"/>
             <w:rFonts w:ascii="Tahoma" w:hAnsi="Tahoma" w:cs="Tahoma"/>
             <w:noProof/>
           </w:rPr>
@@ -1676,7 +1676,7 @@
         </w:r>
         <w:r>
           <w:rPr>
-            <w:rStyle w:val="Hipervnculo"/>
+            <w:rStyle w:val="Hyperlink"/>
             <w:rFonts w:ascii="Tahoma" w:hAnsi="Tahoma" w:cs="Tahoma"/>
             <w:noProof/>
           </w:rPr>
@@ -1734,7 +1734,7 @@
     </w:p>
     <w:p>
       <w:pPr>
-        <w:pStyle w:val="TDC1"/>
+        <w:pStyle w:val="TOC1"/>
         <w:tabs>
           <w:tab w:val="left" w:pos="1540"/>
           <w:tab w:val="right" w:leader="dot" w:pos="8494"/>
@@ -1755,7 +1755,7 @@
       <w:hyperlink w:anchor="_Toc180586131" w:history="1">
         <w:r>
           <w:rPr>
-            <w:rStyle w:val="Hipervnculo"/>
+            <w:rStyle w:val="Hyperlink"/>
             <w:rFonts w:ascii="Tahoma" w:hAnsi="Tahoma" w:cs="Tahoma"/>
             <w:noProof/>
           </w:rPr>
@@ -1778,7 +1778,7 @@
         </w:r>
         <w:r>
           <w:rPr>
-            <w:rStyle w:val="Hipervnculo"/>
+            <w:rStyle w:val="Hyperlink"/>
             <w:rFonts w:ascii="Tahoma" w:hAnsi="Tahoma" w:cs="Tahoma"/>
             <w:noProof/>
           </w:rPr>
@@ -1836,7 +1836,7 @@
     </w:p>
     <w:p>
       <w:pPr>
-        <w:pStyle w:val="TDC2"/>
+        <w:pStyle w:val="TOC2"/>
         <w:rPr>
           <w:rFonts w:eastAsiaTheme="minorEastAsia"/>
           <w:smallCaps w:val="0"/>
@@ -1851,7 +1851,7 @@
       <w:hyperlink w:anchor="_Toc180586132" w:history="1">
         <w:r>
           <w:rPr>
-            <w:rStyle w:val="Hipervnculo"/>
+            <w:rStyle w:val="Hyperlink"/>
             <w:rFonts w:ascii="Tahoma" w:hAnsi="Tahoma" w:cs="Tahoma"/>
             <w:noProof/>
           </w:rPr>
@@ -1872,7 +1872,7 @@
         </w:r>
         <w:r>
           <w:rPr>
-            <w:rStyle w:val="Hipervnculo"/>
+            <w:rStyle w:val="Hyperlink"/>
             <w:rFonts w:ascii="Tahoma" w:hAnsi="Tahoma" w:cs="Tahoma"/>
             <w:noProof/>
           </w:rPr>
@@ -1930,7 +1930,7 @@
     </w:p>
     <w:p>
       <w:pPr>
-        <w:pStyle w:val="TDC2"/>
+        <w:pStyle w:val="TOC2"/>
         <w:rPr>
           <w:rFonts w:eastAsiaTheme="minorEastAsia"/>
           <w:smallCaps w:val="0"/>
@@ -1945,7 +1945,7 @@
       <w:hyperlink w:anchor="_Toc180586133" w:history="1">
         <w:r>
           <w:rPr>
-            <w:rStyle w:val="Hipervnculo"/>
+            <w:rStyle w:val="Hyperlink"/>
             <w:rFonts w:ascii="Tahoma" w:hAnsi="Tahoma" w:cs="Tahoma"/>
             <w:noProof/>
           </w:rPr>
@@ -1966,7 +1966,7 @@
         </w:r>
         <w:r>
           <w:rPr>
-            <w:rStyle w:val="Hipervnculo"/>
+            <w:rStyle w:val="Hyperlink"/>
             <w:rFonts w:ascii="Tahoma" w:hAnsi="Tahoma" w:cs="Tahoma"/>
             <w:noProof/>
           </w:rPr>
@@ -2024,7 +2024,7 @@
     </w:p>
     <w:p>
       <w:pPr>
-        <w:pStyle w:val="TDC1"/>
+        <w:pStyle w:val="TOC1"/>
         <w:tabs>
           <w:tab w:val="left" w:pos="1540"/>
           <w:tab w:val="right" w:leader="dot" w:pos="8494"/>
@@ -2045,7 +2045,7 @@
       <w:hyperlink w:anchor="_Toc180586134" w:history="1">
         <w:r>
           <w:rPr>
-            <w:rStyle w:val="Hipervnculo"/>
+            <w:rStyle w:val="Hyperlink"/>
             <w:rFonts w:ascii="Tahoma" w:hAnsi="Tahoma" w:cs="Tahoma"/>
             <w:noProof/>
           </w:rPr>
@@ -2068,7 +2068,7 @@
         </w:r>
         <w:r>
           <w:rPr>
-            <w:rStyle w:val="Hipervnculo"/>
+            <w:rStyle w:val="Hyperlink"/>
             <w:rFonts w:ascii="Tahoma" w:hAnsi="Tahoma" w:cs="Tahoma"/>
             <w:noProof/>
           </w:rPr>
@@ -2126,7 +2126,7 @@
     </w:p>
     <w:p>
       <w:pPr>
-        <w:pStyle w:val="TDC2"/>
+        <w:pStyle w:val="TOC2"/>
         <w:rPr>
           <w:rFonts w:eastAsiaTheme="minorEastAsia"/>
           <w:smallCaps w:val="0"/>
@@ -2141,7 +2141,7 @@
       <w:hyperlink w:anchor="_Toc180586135" w:history="1">
         <w:r>
           <w:rPr>
-            <w:rStyle w:val="Hipervnculo"/>
+            <w:rStyle w:val="Hyperlink"/>
             <w:rFonts w:ascii="Tahoma" w:hAnsi="Tahoma" w:cs="Tahoma"/>
             <w:noProof/>
           </w:rPr>
@@ -2162,7 +2162,7 @@
         </w:r>
         <w:r>
           <w:rPr>
-            <w:rStyle w:val="Hipervnculo"/>
+            <w:rStyle w:val="Hyperlink"/>
             <w:rFonts w:ascii="Tahoma" w:hAnsi="Tahoma" w:cs="Tahoma"/>
             <w:noProof/>
           </w:rPr>
@@ -2220,7 +2220,7 @@
     </w:p>
     <w:p>
       <w:pPr>
-        <w:pStyle w:val="TDC2"/>
+        <w:pStyle w:val="TOC2"/>
         <w:rPr>
           <w:rFonts w:eastAsiaTheme="minorEastAsia"/>
           <w:smallCaps w:val="0"/>
@@ -2235,7 +2235,7 @@
       <w:hyperlink w:anchor="_Toc180586136" w:history="1">
         <w:r>
           <w:rPr>
-            <w:rStyle w:val="Hipervnculo"/>
+            <w:rStyle w:val="Hyperlink"/>
             <w:rFonts w:ascii="Tahoma" w:hAnsi="Tahoma" w:cs="Tahoma"/>
             <w:noProof/>
           </w:rPr>
@@ -2256,7 +2256,7 @@
         </w:r>
         <w:r>
           <w:rPr>
-            <w:rStyle w:val="Hipervnculo"/>
+            <w:rStyle w:val="Hyperlink"/>
             <w:rFonts w:ascii="Tahoma" w:hAnsi="Tahoma" w:cs="Tahoma"/>
             <w:noProof/>
           </w:rPr>
@@ -2314,7 +2314,7 @@
     </w:p>
     <w:p>
       <w:pPr>
-        <w:pStyle w:val="TDC1"/>
+        <w:pStyle w:val="TOC1"/>
         <w:tabs>
           <w:tab w:val="left" w:pos="1540"/>
           <w:tab w:val="right" w:leader="dot" w:pos="8494"/>
@@ -2335,7 +2335,7 @@
       <w:hyperlink w:anchor="_Toc180586137" w:history="1">
         <w:r>
           <w:rPr>
-            <w:rStyle w:val="Hipervnculo"/>
+            <w:rStyle w:val="Hyperlink"/>
             <w:rFonts w:ascii="Tahoma" w:hAnsi="Tahoma" w:cs="Tahoma"/>
             <w:noProof/>
           </w:rPr>
@@ -2358,7 +2358,7 @@
         </w:r>
         <w:r>
           <w:rPr>
-            <w:rStyle w:val="Hipervnculo"/>
+            <w:rStyle w:val="Hyperlink"/>
             <w:rFonts w:ascii="Tahoma" w:hAnsi="Tahoma" w:cs="Tahoma"/>
             <w:noProof/>
           </w:rPr>
@@ -2416,7 +2416,7 @@
     </w:p>
     <w:p>
       <w:pPr>
-        <w:pStyle w:val="TDC2"/>
+        <w:pStyle w:val="TOC2"/>
         <w:rPr>
           <w:rFonts w:eastAsiaTheme="minorEastAsia"/>
           <w:smallCaps w:val="0"/>
@@ -2431,7 +2431,7 @@
       <w:hyperlink w:anchor="_Toc180586138" w:history="1">
         <w:r>
           <w:rPr>
-            <w:rStyle w:val="Hipervnculo"/>
+            <w:rStyle w:val="Hyperlink"/>
             <w:rFonts w:ascii="Tahoma" w:hAnsi="Tahoma" w:cs="Tahoma"/>
             <w:noProof/>
           </w:rPr>
@@ -2452,7 +2452,7 @@
         </w:r>
         <w:r>
           <w:rPr>
-            <w:rStyle w:val="Hipervnculo"/>
+            <w:rStyle w:val="Hyperlink"/>
             <w:rFonts w:ascii="Tahoma" w:hAnsi="Tahoma" w:cs="Tahoma"/>
             <w:noProof/>
           </w:rPr>
@@ -2510,7 +2510,7 @@
     </w:p>
     <w:p>
       <w:pPr>
-        <w:pStyle w:val="TDC3"/>
+        <w:pStyle w:val="TOC3"/>
         <w:tabs>
           <w:tab w:val="left" w:pos="1320"/>
           <w:tab w:val="right" w:leader="dot" w:pos="8494"/>
@@ -2530,7 +2530,7 @@
       <w:hyperlink w:anchor="_Toc180586139" w:history="1">
         <w:r>
           <w:rPr>
-            <w:rStyle w:val="Hipervnculo"/>
+            <w:rStyle w:val="Hyperlink"/>
             <w:rFonts w:ascii="Tahoma" w:hAnsi="Tahoma" w:cs="Tahoma"/>
             <w:noProof/>
           </w:rPr>
@@ -2552,7 +2552,7 @@
         </w:r>
         <w:r>
           <w:rPr>
-            <w:rStyle w:val="Hipervnculo"/>
+            <w:rStyle w:val="Hyperlink"/>
             <w:rFonts w:ascii="Tahoma" w:hAnsi="Tahoma" w:cs="Tahoma"/>
             <w:noProof/>
           </w:rPr>
@@ -2610,7 +2610,7 @@
     </w:p>
     <w:p>
       <w:pPr>
-        <w:pStyle w:val="TDC2"/>
+        <w:pStyle w:val="TOC2"/>
         <w:rPr>
           <w:rFonts w:eastAsiaTheme="minorEastAsia"/>
           <w:smallCaps w:val="0"/>
@@ -2625,7 +2625,7 @@
       <w:hyperlink w:anchor="_Toc180586140" w:history="1">
         <w:r>
           <w:rPr>
-            <w:rStyle w:val="Hipervnculo"/>
+            <w:rStyle w:val="Hyperlink"/>
             <w:rFonts w:ascii="Tahoma" w:hAnsi="Tahoma" w:cs="Tahoma"/>
             <w:noProof/>
           </w:rPr>
@@ -2646,7 +2646,7 @@
         </w:r>
         <w:r>
           <w:rPr>
-            <w:rStyle w:val="Hipervnculo"/>
+            <w:rStyle w:val="Hyperlink"/>
             <w:rFonts w:ascii="Tahoma" w:hAnsi="Tahoma" w:cs="Tahoma"/>
             <w:noProof/>
           </w:rPr>
@@ -2704,7 +2704,7 @@
     </w:p>
     <w:p>
       <w:pPr>
-        <w:pStyle w:val="TDC3"/>
+        <w:pStyle w:val="TOC3"/>
         <w:tabs>
           <w:tab w:val="left" w:pos="1320"/>
           <w:tab w:val="right" w:leader="dot" w:pos="8494"/>
@@ -2724,7 +2724,7 @@
       <w:hyperlink w:anchor="_Toc180586141" w:history="1">
         <w:r>
           <w:rPr>
-            <w:rStyle w:val="Hipervnculo"/>
+            <w:rStyle w:val="Hyperlink"/>
             <w:rFonts w:ascii="Tahoma" w:hAnsi="Tahoma" w:cs="Tahoma"/>
             <w:noProof/>
           </w:rPr>
@@ -2746,7 +2746,7 @@
         </w:r>
         <w:r>
           <w:rPr>
-            <w:rStyle w:val="Hipervnculo"/>
+            <w:rStyle w:val="Hyperlink"/>
             <w:rFonts w:ascii="Tahoma" w:hAnsi="Tahoma" w:cs="Tahoma"/>
             <w:noProof/>
           </w:rPr>
@@ -2804,7 +2804,7 @@
     </w:p>
     <w:p>
       <w:pPr>
-        <w:pStyle w:val="TDC3"/>
+        <w:pStyle w:val="TOC3"/>
         <w:tabs>
           <w:tab w:val="left" w:pos="1320"/>
           <w:tab w:val="right" w:leader="dot" w:pos="8494"/>
@@ -2824,7 +2824,7 @@
       <w:hyperlink w:anchor="_Toc180586142" w:history="1">
         <w:r>
           <w:rPr>
-            <w:rStyle w:val="Hipervnculo"/>
+            <w:rStyle w:val="Hyperlink"/>
             <w:rFonts w:ascii="Tahoma" w:hAnsi="Tahoma" w:cs="Tahoma"/>
             <w:noProof/>
           </w:rPr>
@@ -2846,7 +2846,7 @@
         </w:r>
         <w:r>
           <w:rPr>
-            <w:rStyle w:val="Hipervnculo"/>
+            <w:rStyle w:val="Hyperlink"/>
             <w:rFonts w:ascii="Tahoma" w:hAnsi="Tahoma" w:cs="Tahoma"/>
             <w:noProof/>
           </w:rPr>
@@ -2904,7 +2904,7 @@
     </w:p>
     <w:p>
       <w:pPr>
-        <w:pStyle w:val="TDC2"/>
+        <w:pStyle w:val="TOC2"/>
         <w:rPr>
           <w:rFonts w:eastAsiaTheme="minorEastAsia"/>
           <w:smallCaps w:val="0"/>
@@ -2919,7 +2919,7 @@
       <w:hyperlink w:anchor="_Toc180586143" w:history="1">
         <w:r>
           <w:rPr>
-            <w:rStyle w:val="Hipervnculo"/>
+            <w:rStyle w:val="Hyperlink"/>
             <w:rFonts w:ascii="Tahoma" w:hAnsi="Tahoma" w:cs="Tahoma"/>
             <w:noProof/>
           </w:rPr>
@@ -2940,7 +2940,7 @@
         </w:r>
         <w:r>
           <w:rPr>
-            <w:rStyle w:val="Hipervnculo"/>
+            <w:rStyle w:val="Hyperlink"/>
             <w:rFonts w:ascii="Tahoma" w:hAnsi="Tahoma" w:cs="Tahoma"/>
             <w:noProof/>
           </w:rPr>
@@ -2998,7 +2998,7 @@
     </w:p>
     <w:p>
       <w:pPr>
-        <w:pStyle w:val="TDC2"/>
+        <w:pStyle w:val="TOC2"/>
         <w:rPr>
           <w:rFonts w:eastAsiaTheme="minorEastAsia"/>
           <w:smallCaps w:val="0"/>
@@ -3013,7 +3013,7 @@
       <w:hyperlink w:anchor="_Toc180586144" w:history="1">
         <w:r>
           <w:rPr>
-            <w:rStyle w:val="Hipervnculo"/>
+            <w:rStyle w:val="Hyperlink"/>
             <w:rFonts w:ascii="Tahoma" w:hAnsi="Tahoma" w:cs="Tahoma"/>
             <w:noProof/>
           </w:rPr>
@@ -3034,7 +3034,7 @@
         </w:r>
         <w:r>
           <w:rPr>
-            <w:rStyle w:val="Hipervnculo"/>
+            <w:rStyle w:val="Hyperlink"/>
             <w:rFonts w:ascii="Tahoma" w:hAnsi="Tahoma" w:cs="Tahoma"/>
             <w:noProof/>
           </w:rPr>
@@ -3092,7 +3092,7 @@
     </w:p>
     <w:p>
       <w:pPr>
-        <w:pStyle w:val="TDC2"/>
+        <w:pStyle w:val="TOC2"/>
         <w:rPr>
           <w:rFonts w:eastAsiaTheme="minorEastAsia"/>
           <w:smallCaps w:val="0"/>
@@ -3107,7 +3107,7 @@
       <w:hyperlink w:anchor="_Toc180586145" w:history="1">
         <w:r>
           <w:rPr>
-            <w:rStyle w:val="Hipervnculo"/>
+            <w:rStyle w:val="Hyperlink"/>
             <w:rFonts w:ascii="Tahoma" w:hAnsi="Tahoma" w:cs="Tahoma"/>
             <w:noProof/>
           </w:rPr>
@@ -3128,7 +3128,7 @@
         </w:r>
         <w:r>
           <w:rPr>
-            <w:rStyle w:val="Hipervnculo"/>
+            <w:rStyle w:val="Hyperlink"/>
             <w:rFonts w:ascii="Tahoma" w:hAnsi="Tahoma" w:cs="Tahoma"/>
             <w:noProof/>
           </w:rPr>
@@ -3186,7 +3186,7 @@
     </w:p>
     <w:p>
       <w:pPr>
-        <w:pStyle w:val="TDC2"/>
+        <w:pStyle w:val="TOC2"/>
         <w:rPr>
           <w:rFonts w:eastAsiaTheme="minorEastAsia"/>
           <w:smallCaps w:val="0"/>
@@ -3201,7 +3201,7 @@
       <w:hyperlink w:anchor="_Toc180586146" w:history="1">
         <w:r>
           <w:rPr>
-            <w:rStyle w:val="Hipervnculo"/>
+            <w:rStyle w:val="Hyperlink"/>
             <w:rFonts w:ascii="Tahoma" w:hAnsi="Tahoma" w:cs="Tahoma"/>
             <w:noProof/>
           </w:rPr>
@@ -3222,7 +3222,7 @@
         </w:r>
         <w:r>
           <w:rPr>
-            <w:rStyle w:val="Hipervnculo"/>
+            <w:rStyle w:val="Hyperlink"/>
             <w:rFonts w:ascii="Tahoma" w:hAnsi="Tahoma" w:cs="Tahoma"/>
             <w:noProof/>
           </w:rPr>
@@ -3280,7 +3280,7 @@
     </w:p>
     <w:p>
       <w:pPr>
-        <w:pStyle w:val="TDC1"/>
+        <w:pStyle w:val="TOC1"/>
         <w:tabs>
           <w:tab w:val="left" w:pos="1540"/>
           <w:tab w:val="right" w:leader="dot" w:pos="8494"/>
@@ -3301,7 +3301,7 @@
       <w:hyperlink w:anchor="_Toc180586147" w:history="1">
         <w:r>
           <w:rPr>
-            <w:rStyle w:val="Hipervnculo"/>
+            <w:rStyle w:val="Hyperlink"/>
             <w:rFonts w:ascii="Tahoma" w:hAnsi="Tahoma" w:cs="Tahoma"/>
             <w:noProof/>
           </w:rPr>
@@ -3324,7 +3324,7 @@
         </w:r>
         <w:r>
           <w:rPr>
-            <w:rStyle w:val="Hipervnculo"/>
+            <w:rStyle w:val="Hyperlink"/>
             <w:rFonts w:ascii="Tahoma" w:hAnsi="Tahoma" w:cs="Tahoma"/>
             <w:noProof/>
           </w:rPr>
@@ -3382,7 +3382,7 @@
     </w:p>
     <w:p>
       <w:pPr>
-        <w:pStyle w:val="TDC2"/>
+        <w:pStyle w:val="TOC2"/>
         <w:rPr>
           <w:rFonts w:eastAsiaTheme="minorEastAsia"/>
           <w:smallCaps w:val="0"/>
@@ -3397,7 +3397,7 @@
       <w:hyperlink w:anchor="_Toc180586148" w:history="1">
         <w:r>
           <w:rPr>
-            <w:rStyle w:val="Hipervnculo"/>
+            <w:rStyle w:val="Hyperlink"/>
             <w:rFonts w:ascii="Tahoma" w:hAnsi="Tahoma" w:cs="Tahoma"/>
             <w:noProof/>
           </w:rPr>
@@ -3418,7 +3418,7 @@
         </w:r>
         <w:r>
           <w:rPr>
-            <w:rStyle w:val="Hipervnculo"/>
+            <w:rStyle w:val="Hyperlink"/>
             <w:rFonts w:ascii="Tahoma" w:hAnsi="Tahoma" w:cs="Tahoma"/>
             <w:noProof/>
           </w:rPr>
@@ -3476,7 +3476,7 @@
     </w:p>
     <w:p>
       <w:pPr>
-        <w:pStyle w:val="TDC2"/>
+        <w:pStyle w:val="TOC2"/>
         <w:rPr>
           <w:rFonts w:eastAsiaTheme="minorEastAsia"/>
           <w:smallCaps w:val="0"/>
@@ -3491,7 +3491,7 @@
       <w:hyperlink w:anchor="_Toc180586149" w:history="1">
         <w:r>
           <w:rPr>
-            <w:rStyle w:val="Hipervnculo"/>
+            <w:rStyle w:val="Hyperlink"/>
             <w:rFonts w:ascii="Tahoma" w:hAnsi="Tahoma" w:cs="Tahoma"/>
             <w:noProof/>
           </w:rPr>
@@ -3512,7 +3512,7 @@
         </w:r>
         <w:r>
           <w:rPr>
-            <w:rStyle w:val="Hipervnculo"/>
+            <w:rStyle w:val="Hyperlink"/>
             <w:rFonts w:ascii="Tahoma" w:hAnsi="Tahoma" w:cs="Tahoma"/>
             <w:noProof/>
           </w:rPr>
@@ -3570,7 +3570,7 @@
     </w:p>
     <w:p>
       <w:pPr>
-        <w:pStyle w:val="TDC3"/>
+        <w:pStyle w:val="TOC3"/>
         <w:tabs>
           <w:tab w:val="left" w:pos="1320"/>
           <w:tab w:val="right" w:leader="dot" w:pos="8494"/>
@@ -3590,7 +3590,7 @@
       <w:hyperlink w:anchor="_Toc180586150" w:history="1">
         <w:r>
           <w:rPr>
-            <w:rStyle w:val="Hipervnculo"/>
+            <w:rStyle w:val="Hyperlink"/>
             <w:rFonts w:ascii="Tahoma" w:hAnsi="Tahoma" w:cs="Tahoma"/>
             <w:noProof/>
           </w:rPr>
@@ -3612,7 +3612,7 @@
         </w:r>
         <w:r>
           <w:rPr>
-            <w:rStyle w:val="Hipervnculo"/>
+            <w:rStyle w:val="Hyperlink"/>
             <w:rFonts w:ascii="Tahoma" w:hAnsi="Tahoma" w:cs="Tahoma"/>
             <w:noProof/>
           </w:rPr>
@@ -3670,7 +3670,7 @@
     </w:p>
     <w:p>
       <w:pPr>
-        <w:pStyle w:val="TDC3"/>
+        <w:pStyle w:val="TOC3"/>
         <w:tabs>
           <w:tab w:val="left" w:pos="1320"/>
           <w:tab w:val="right" w:leader="dot" w:pos="8494"/>
@@ -3690,7 +3690,7 @@
       <w:hyperlink w:anchor="_Toc180586151" w:history="1">
         <w:r>
           <w:rPr>
-            <w:rStyle w:val="Hipervnculo"/>
+            <w:rStyle w:val="Hyperlink"/>
             <w:rFonts w:ascii="Tahoma" w:hAnsi="Tahoma" w:cs="Tahoma"/>
             <w:noProof/>
           </w:rPr>
@@ -3712,7 +3712,7 @@
         </w:r>
         <w:r>
           <w:rPr>
-            <w:rStyle w:val="Hipervnculo"/>
+            <w:rStyle w:val="Hyperlink"/>
             <w:rFonts w:ascii="Tahoma" w:hAnsi="Tahoma" w:cs="Tahoma"/>
             <w:noProof/>
           </w:rPr>
@@ -3770,7 +3770,7 @@
     </w:p>
     <w:p>
       <w:pPr>
-        <w:pStyle w:val="TDC3"/>
+        <w:pStyle w:val="TOC3"/>
         <w:tabs>
           <w:tab w:val="left" w:pos="1320"/>
           <w:tab w:val="right" w:leader="dot" w:pos="8494"/>
@@ -3790,7 +3790,7 @@
       <w:hyperlink w:anchor="_Toc180586152" w:history="1">
         <w:r>
           <w:rPr>
-            <w:rStyle w:val="Hipervnculo"/>
+            <w:rStyle w:val="Hyperlink"/>
             <w:rFonts w:ascii="Tahoma" w:hAnsi="Tahoma" w:cs="Tahoma"/>
             <w:noProof/>
           </w:rPr>
@@ -3812,7 +3812,7 @@
         </w:r>
         <w:r>
           <w:rPr>
-            <w:rStyle w:val="Hipervnculo"/>
+            <w:rStyle w:val="Hyperlink"/>
             <w:rFonts w:ascii="Tahoma" w:hAnsi="Tahoma" w:cs="Tahoma"/>
             <w:noProof/>
           </w:rPr>
@@ -3870,7 +3870,7 @@
     </w:p>
     <w:p>
       <w:pPr>
-        <w:pStyle w:val="TDC3"/>
+        <w:pStyle w:val="TOC3"/>
         <w:tabs>
           <w:tab w:val="left" w:pos="1320"/>
           <w:tab w:val="right" w:leader="dot" w:pos="8494"/>
@@ -3890,7 +3890,7 @@
       <w:hyperlink w:anchor="_Toc180586153" w:history="1">
         <w:r>
           <w:rPr>
-            <w:rStyle w:val="Hipervnculo"/>
+            <w:rStyle w:val="Hyperlink"/>
             <w:rFonts w:ascii="Tahoma" w:hAnsi="Tahoma" w:cs="Tahoma"/>
             <w:noProof/>
           </w:rPr>
@@ -3912,7 +3912,7 @@
         </w:r>
         <w:r>
           <w:rPr>
-            <w:rStyle w:val="Hipervnculo"/>
+            <w:rStyle w:val="Hyperlink"/>
             <w:rFonts w:ascii="Tahoma" w:hAnsi="Tahoma" w:cs="Tahoma"/>
             <w:noProof/>
           </w:rPr>
@@ -3970,7 +3970,7 @@
     </w:p>
     <w:p>
       <w:pPr>
-        <w:pStyle w:val="TDC3"/>
+        <w:pStyle w:val="TOC3"/>
         <w:tabs>
           <w:tab w:val="left" w:pos="1320"/>
           <w:tab w:val="right" w:leader="dot" w:pos="8494"/>
@@ -3990,7 +3990,7 @@
       <w:hyperlink w:anchor="_Toc180586154" w:history="1">
         <w:r>
           <w:rPr>
-            <w:rStyle w:val="Hipervnculo"/>
+            <w:rStyle w:val="Hyperlink"/>
             <w:rFonts w:ascii="Tahoma" w:hAnsi="Tahoma" w:cs="Tahoma"/>
             <w:noProof/>
           </w:rPr>
@@ -4012,7 +4012,7 @@
         </w:r>
         <w:r>
           <w:rPr>
-            <w:rStyle w:val="Hipervnculo"/>
+            <w:rStyle w:val="Hyperlink"/>
             <w:rFonts w:ascii="Tahoma" w:hAnsi="Tahoma" w:cs="Tahoma"/>
             <w:noProof/>
           </w:rPr>
@@ -4070,7 +4070,7 @@
     </w:p>
     <w:p>
       <w:pPr>
-        <w:pStyle w:val="TDC3"/>
+        <w:pStyle w:val="TOC3"/>
         <w:tabs>
           <w:tab w:val="left" w:pos="1320"/>
           <w:tab w:val="right" w:leader="dot" w:pos="8494"/>
@@ -4090,7 +4090,7 @@
       <w:hyperlink w:anchor="_Toc180586155" w:history="1">
         <w:r>
           <w:rPr>
-            <w:rStyle w:val="Hipervnculo"/>
+            <w:rStyle w:val="Hyperlink"/>
             <w:rFonts w:ascii="Tahoma" w:hAnsi="Tahoma" w:cs="Tahoma"/>
             <w:noProof/>
           </w:rPr>
@@ -4112,7 +4112,7 @@
         </w:r>
         <w:r>
           <w:rPr>
-            <w:rStyle w:val="Hipervnculo"/>
+            <w:rStyle w:val="Hyperlink"/>
             <w:rFonts w:ascii="Tahoma" w:hAnsi="Tahoma" w:cs="Tahoma"/>
             <w:noProof/>
           </w:rPr>
@@ -4170,7 +4170,7 @@
     </w:p>
     <w:p>
       <w:pPr>
-        <w:pStyle w:val="TDC3"/>
+        <w:pStyle w:val="TOC3"/>
         <w:tabs>
           <w:tab w:val="left" w:pos="1320"/>
           <w:tab w:val="right" w:leader="dot" w:pos="8494"/>
@@ -4190,7 +4190,7 @@
       <w:hyperlink w:anchor="_Toc180586156" w:history="1">
         <w:r>
           <w:rPr>
-            <w:rStyle w:val="Hipervnculo"/>
+            <w:rStyle w:val="Hyperlink"/>
             <w:rFonts w:ascii="Tahoma" w:hAnsi="Tahoma" w:cs="Tahoma"/>
             <w:noProof/>
           </w:rPr>
@@ -4212,7 +4212,7 @@
         </w:r>
         <w:r>
           <w:rPr>
-            <w:rStyle w:val="Hipervnculo"/>
+            <w:rStyle w:val="Hyperlink"/>
             <w:rFonts w:ascii="Tahoma" w:hAnsi="Tahoma" w:cs="Tahoma"/>
             <w:noProof/>
           </w:rPr>
@@ -4270,7 +4270,7 @@
     </w:p>
     <w:p>
       <w:pPr>
-        <w:pStyle w:val="TDC2"/>
+        <w:pStyle w:val="TOC2"/>
         <w:rPr>
           <w:rFonts w:eastAsiaTheme="minorEastAsia"/>
           <w:smallCaps w:val="0"/>
@@ -4285,7 +4285,7 @@
       <w:hyperlink w:anchor="_Toc180586157" w:history="1">
         <w:r>
           <w:rPr>
-            <w:rStyle w:val="Hipervnculo"/>
+            <w:rStyle w:val="Hyperlink"/>
             <w:rFonts w:ascii="Tahoma" w:hAnsi="Tahoma" w:cs="Tahoma"/>
             <w:noProof/>
           </w:rPr>
@@ -4306,7 +4306,7 @@
         </w:r>
         <w:r>
           <w:rPr>
-            <w:rStyle w:val="Hipervnculo"/>
+            <w:rStyle w:val="Hyperlink"/>
             <w:rFonts w:ascii="Tahoma" w:hAnsi="Tahoma" w:cs="Tahoma"/>
             <w:noProof/>
           </w:rPr>
@@ -4364,7 +4364,7 @@
     </w:p>
     <w:p>
       <w:pPr>
-        <w:pStyle w:val="TDC1"/>
+        <w:pStyle w:val="TOC1"/>
         <w:tabs>
           <w:tab w:val="left" w:pos="1540"/>
           <w:tab w:val="right" w:leader="dot" w:pos="8494"/>
@@ -4385,7 +4385,7 @@
       <w:hyperlink w:anchor="_Toc180586158" w:history="1">
         <w:r>
           <w:rPr>
-            <w:rStyle w:val="Hipervnculo"/>
+            <w:rStyle w:val="Hyperlink"/>
             <w:rFonts w:ascii="Tahoma" w:hAnsi="Tahoma" w:cs="Tahoma"/>
             <w:noProof/>
           </w:rPr>
@@ -4408,7 +4408,7 @@
         </w:r>
         <w:r>
           <w:rPr>
-            <w:rStyle w:val="Hipervnculo"/>
+            <w:rStyle w:val="Hyperlink"/>
             <w:rFonts w:ascii="Tahoma" w:hAnsi="Tahoma" w:cs="Tahoma"/>
             <w:noProof/>
           </w:rPr>
@@ -4466,7 +4466,7 @@
     </w:p>
     <w:p>
       <w:pPr>
-        <w:pStyle w:val="TDC2"/>
+        <w:pStyle w:val="TOC2"/>
         <w:rPr>
           <w:rFonts w:eastAsiaTheme="minorEastAsia"/>
           <w:smallCaps w:val="0"/>
@@ -4481,7 +4481,7 @@
       <w:hyperlink w:anchor="_Toc180586159" w:history="1">
         <w:r>
           <w:rPr>
-            <w:rStyle w:val="Hipervnculo"/>
+            <w:rStyle w:val="Hyperlink"/>
             <w:rFonts w:ascii="Tahoma" w:hAnsi="Tahoma" w:cs="Tahoma"/>
             <w:noProof/>
           </w:rPr>
@@ -4502,7 +4502,7 @@
         </w:r>
         <w:r>
           <w:rPr>
-            <w:rStyle w:val="Hipervnculo"/>
+            <w:rStyle w:val="Hyperlink"/>
             <w:rFonts w:ascii="Tahoma" w:hAnsi="Tahoma" w:cs="Tahoma"/>
             <w:noProof/>
           </w:rPr>
@@ -4560,7 +4560,7 @@
     </w:p>
     <w:p>
       <w:pPr>
-        <w:pStyle w:val="TDC3"/>
+        <w:pStyle w:val="TOC3"/>
         <w:tabs>
           <w:tab w:val="left" w:pos="1320"/>
           <w:tab w:val="right" w:leader="dot" w:pos="8494"/>
@@ -4580,7 +4580,7 @@
       <w:hyperlink w:anchor="_Toc180586160" w:history="1">
         <w:r>
           <w:rPr>
-            <w:rStyle w:val="Hipervnculo"/>
+            <w:rStyle w:val="Hyperlink"/>
             <w:rFonts w:ascii="Tahoma" w:hAnsi="Tahoma" w:cs="Tahoma"/>
             <w:noProof/>
           </w:rPr>
@@ -4602,7 +4602,7 @@
         </w:r>
         <w:r>
           <w:rPr>
-            <w:rStyle w:val="Hipervnculo"/>
+            <w:rStyle w:val="Hyperlink"/>
             <w:rFonts w:ascii="Tahoma" w:hAnsi="Tahoma" w:cs="Tahoma"/>
             <w:noProof/>
           </w:rPr>
@@ -4660,7 +4660,7 @@
     </w:p>
     <w:p>
       <w:pPr>
-        <w:pStyle w:val="TDC3"/>
+        <w:pStyle w:val="TOC3"/>
         <w:tabs>
           <w:tab w:val="left" w:pos="1320"/>
           <w:tab w:val="right" w:leader="dot" w:pos="8494"/>
@@ -4680,7 +4680,7 @@
       <w:hyperlink w:anchor="_Toc180586161" w:history="1">
         <w:r>
           <w:rPr>
-            <w:rStyle w:val="Hipervnculo"/>
+            <w:rStyle w:val="Hyperlink"/>
             <w:rFonts w:ascii="Tahoma" w:hAnsi="Tahoma" w:cs="Tahoma"/>
             <w:noProof/>
           </w:rPr>
@@ -4702,7 +4702,7 @@
         </w:r>
         <w:r>
           <w:rPr>
-            <w:rStyle w:val="Hipervnculo"/>
+            <w:rStyle w:val="Hyperlink"/>
             <w:rFonts w:ascii="Tahoma" w:hAnsi="Tahoma" w:cs="Tahoma"/>
             <w:noProof/>
           </w:rPr>
@@ -4760,7 +4760,7 @@
     </w:p>
     <w:p>
       <w:pPr>
-        <w:pStyle w:val="TDC3"/>
+        <w:pStyle w:val="TOC3"/>
         <w:tabs>
           <w:tab w:val="left" w:pos="1320"/>
           <w:tab w:val="right" w:leader="dot" w:pos="8494"/>
@@ -4780,7 +4780,7 @@
       <w:hyperlink w:anchor="_Toc180586162" w:history="1">
         <w:r>
           <w:rPr>
-            <w:rStyle w:val="Hipervnculo"/>
+            <w:rStyle w:val="Hyperlink"/>
             <w:rFonts w:ascii="Tahoma" w:hAnsi="Tahoma" w:cs="Tahoma"/>
             <w:noProof/>
           </w:rPr>
@@ -4802,7 +4802,7 @@
         </w:r>
         <w:r>
           <w:rPr>
-            <w:rStyle w:val="Hipervnculo"/>
+            <w:rStyle w:val="Hyperlink"/>
             <w:rFonts w:ascii="Tahoma" w:hAnsi="Tahoma" w:cs="Tahoma"/>
             <w:noProof/>
           </w:rPr>
@@ -4860,7 +4860,7 @@
     </w:p>
     <w:p>
       <w:pPr>
-        <w:pStyle w:val="TDC2"/>
+        <w:pStyle w:val="TOC2"/>
         <w:rPr>
           <w:rFonts w:eastAsiaTheme="minorEastAsia"/>
           <w:smallCaps w:val="0"/>
@@ -4875,7 +4875,7 @@
       <w:hyperlink w:anchor="_Toc180586163" w:history="1">
         <w:r>
           <w:rPr>
-            <w:rStyle w:val="Hipervnculo"/>
+            <w:rStyle w:val="Hyperlink"/>
             <w:rFonts w:ascii="Tahoma" w:hAnsi="Tahoma" w:cs="Tahoma"/>
             <w:noProof/>
           </w:rPr>
@@ -4896,7 +4896,7 @@
         </w:r>
         <w:r>
           <w:rPr>
-            <w:rStyle w:val="Hipervnculo"/>
+            <w:rStyle w:val="Hyperlink"/>
             <w:rFonts w:ascii="Tahoma" w:hAnsi="Tahoma" w:cs="Tahoma"/>
             <w:noProof/>
           </w:rPr>
@@ -4954,7 +4954,7 @@
     </w:p>
     <w:p>
       <w:pPr>
-        <w:pStyle w:val="TDC3"/>
+        <w:pStyle w:val="TOC3"/>
         <w:tabs>
           <w:tab w:val="left" w:pos="1320"/>
           <w:tab w:val="right" w:leader="dot" w:pos="8494"/>
@@ -4974,7 +4974,7 @@
       <w:hyperlink w:anchor="_Toc180586164" w:history="1">
         <w:r>
           <w:rPr>
-            <w:rStyle w:val="Hipervnculo"/>
+            <w:rStyle w:val="Hyperlink"/>
             <w:rFonts w:ascii="Tahoma" w:hAnsi="Tahoma" w:cs="Tahoma"/>
             <w:noProof/>
           </w:rPr>
@@ -4996,7 +4996,7 @@
         </w:r>
         <w:r>
           <w:rPr>
-            <w:rStyle w:val="Hipervnculo"/>
+            <w:rStyle w:val="Hyperlink"/>
             <w:rFonts w:ascii="Tahoma" w:hAnsi="Tahoma" w:cs="Tahoma"/>
             <w:noProof/>
           </w:rPr>
@@ -5054,7 +5054,7 @@
     </w:p>
     <w:p>
       <w:pPr>
-        <w:pStyle w:val="TDC2"/>
+        <w:pStyle w:val="TOC2"/>
         <w:rPr>
           <w:rFonts w:eastAsiaTheme="minorEastAsia"/>
           <w:smallCaps w:val="0"/>
@@ -5069,7 +5069,7 @@
       <w:hyperlink w:anchor="_Toc180586165" w:history="1">
         <w:r>
           <w:rPr>
-            <w:rStyle w:val="Hipervnculo"/>
+            <w:rStyle w:val="Hyperlink"/>
             <w:rFonts w:ascii="Tahoma" w:hAnsi="Tahoma" w:cs="Tahoma"/>
             <w:noProof/>
           </w:rPr>
@@ -5090,7 +5090,7 @@
         </w:r>
         <w:r>
           <w:rPr>
-            <w:rStyle w:val="Hipervnculo"/>
+            <w:rStyle w:val="Hyperlink"/>
             <w:rFonts w:ascii="Tahoma" w:hAnsi="Tahoma" w:cs="Tahoma"/>
             <w:noProof/>
           </w:rPr>
@@ -5148,7 +5148,7 @@
     </w:p>
     <w:p>
       <w:pPr>
-        <w:pStyle w:val="TDC3"/>
+        <w:pStyle w:val="TOC3"/>
         <w:tabs>
           <w:tab w:val="left" w:pos="1320"/>
           <w:tab w:val="right" w:leader="dot" w:pos="8494"/>
@@ -5168,7 +5168,7 @@
       <w:hyperlink w:anchor="_Toc180586166" w:history="1">
         <w:r>
           <w:rPr>
-            <w:rStyle w:val="Hipervnculo"/>
+            <w:rStyle w:val="Hyperlink"/>
             <w:rFonts w:ascii="Tahoma" w:hAnsi="Tahoma" w:cs="Tahoma"/>
             <w:noProof/>
           </w:rPr>
@@ -5190,7 +5190,7 @@
         </w:r>
         <w:r>
           <w:rPr>
-            <w:rStyle w:val="Hipervnculo"/>
+            <w:rStyle w:val="Hyperlink"/>
             <w:rFonts w:ascii="Tahoma" w:hAnsi="Tahoma" w:cs="Tahoma"/>
             <w:noProof/>
           </w:rPr>
@@ -5248,7 +5248,7 @@
     </w:p>
     <w:p>
       <w:pPr>
-        <w:pStyle w:val="TDC2"/>
+        <w:pStyle w:val="TOC2"/>
         <w:rPr>
           <w:rFonts w:eastAsiaTheme="minorEastAsia"/>
           <w:smallCaps w:val="0"/>
@@ -5263,7 +5263,7 @@
       <w:hyperlink w:anchor="_Toc180586167" w:history="1">
         <w:r>
           <w:rPr>
-            <w:rStyle w:val="Hipervnculo"/>
+            <w:rStyle w:val="Hyperlink"/>
             <w:rFonts w:ascii="Tahoma" w:hAnsi="Tahoma" w:cs="Tahoma"/>
             <w:noProof/>
           </w:rPr>
@@ -5284,7 +5284,7 @@
         </w:r>
         <w:r>
           <w:rPr>
-            <w:rStyle w:val="Hipervnculo"/>
+            <w:rStyle w:val="Hyperlink"/>
             <w:rFonts w:ascii="Tahoma" w:hAnsi="Tahoma" w:cs="Tahoma"/>
             <w:noProof/>
           </w:rPr>
@@ -5342,7 +5342,7 @@
     </w:p>
     <w:p>
       <w:pPr>
-        <w:pStyle w:val="TDC2"/>
+        <w:pStyle w:val="TOC2"/>
         <w:rPr>
           <w:rFonts w:eastAsiaTheme="minorEastAsia"/>
           <w:smallCaps w:val="0"/>
@@ -5357,7 +5357,7 @@
       <w:hyperlink w:anchor="_Toc180586168" w:history="1">
         <w:r>
           <w:rPr>
-            <w:rStyle w:val="Hipervnculo"/>
+            <w:rStyle w:val="Hyperlink"/>
             <w:rFonts w:ascii="Tahoma" w:hAnsi="Tahoma" w:cs="Tahoma"/>
             <w:noProof/>
           </w:rPr>
@@ -5378,7 +5378,7 @@
         </w:r>
         <w:r>
           <w:rPr>
-            <w:rStyle w:val="Hipervnculo"/>
+            <w:rStyle w:val="Hyperlink"/>
             <w:rFonts w:ascii="Tahoma" w:hAnsi="Tahoma" w:cs="Tahoma"/>
             <w:noProof/>
           </w:rPr>
@@ -5436,7 +5436,7 @@
     </w:p>
     <w:p>
       <w:pPr>
-        <w:pStyle w:val="TDC3"/>
+        <w:pStyle w:val="TOC3"/>
         <w:tabs>
           <w:tab w:val="left" w:pos="1320"/>
           <w:tab w:val="right" w:leader="dot" w:pos="8494"/>
@@ -5456,7 +5456,7 @@
       <w:hyperlink w:anchor="_Toc180586169" w:history="1">
         <w:r>
           <w:rPr>
-            <w:rStyle w:val="Hipervnculo"/>
+            <w:rStyle w:val="Hyperlink"/>
             <w:rFonts w:ascii="Tahoma" w:hAnsi="Tahoma" w:cs="Tahoma"/>
             <w:noProof/>
           </w:rPr>
@@ -5478,7 +5478,7 @@
         </w:r>
         <w:r>
           <w:rPr>
-            <w:rStyle w:val="Hipervnculo"/>
+            <w:rStyle w:val="Hyperlink"/>
             <w:rFonts w:ascii="Tahoma" w:hAnsi="Tahoma" w:cs="Tahoma"/>
             <w:noProof/>
           </w:rPr>
@@ -5536,7 +5536,7 @@
     </w:p>
     <w:p>
       <w:pPr>
-        <w:pStyle w:val="TDC3"/>
+        <w:pStyle w:val="TOC3"/>
         <w:tabs>
           <w:tab w:val="left" w:pos="1320"/>
           <w:tab w:val="right" w:leader="dot" w:pos="8494"/>
@@ -5556,7 +5556,7 @@
       <w:hyperlink w:anchor="_Toc180586170" w:history="1">
         <w:r>
           <w:rPr>
-            <w:rStyle w:val="Hipervnculo"/>
+            <w:rStyle w:val="Hyperlink"/>
             <w:rFonts w:ascii="Tahoma" w:hAnsi="Tahoma" w:cs="Tahoma"/>
             <w:noProof/>
           </w:rPr>
@@ -5578,7 +5578,7 @@
         </w:r>
         <w:r>
           <w:rPr>
-            <w:rStyle w:val="Hipervnculo"/>
+            <w:rStyle w:val="Hyperlink"/>
             <w:rFonts w:ascii="Tahoma" w:hAnsi="Tahoma" w:cs="Tahoma"/>
             <w:noProof/>
           </w:rPr>
@@ -5636,7 +5636,7 @@
     </w:p>
     <w:p>
       <w:pPr>
-        <w:pStyle w:val="TDC3"/>
+        <w:pStyle w:val="TOC3"/>
         <w:tabs>
           <w:tab w:val="left" w:pos="1320"/>
           <w:tab w:val="right" w:leader="dot" w:pos="8494"/>
@@ -5656,7 +5656,7 @@
       <w:hyperlink w:anchor="_Toc180586171" w:history="1">
         <w:r>
           <w:rPr>
-            <w:rStyle w:val="Hipervnculo"/>
+            <w:rStyle w:val="Hyperlink"/>
             <w:rFonts w:ascii="Tahoma" w:hAnsi="Tahoma" w:cs="Tahoma"/>
             <w:noProof/>
           </w:rPr>
@@ -5678,7 +5678,7 @@
         </w:r>
         <w:r>
           <w:rPr>
-            <w:rStyle w:val="Hipervnculo"/>
+            <w:rStyle w:val="Hyperlink"/>
             <w:rFonts w:ascii="Tahoma" w:hAnsi="Tahoma" w:cs="Tahoma"/>
             <w:noProof/>
           </w:rPr>
@@ -5736,7 +5736,7 @@
     </w:p>
     <w:p>
       <w:pPr>
-        <w:pStyle w:val="TDC2"/>
+        <w:pStyle w:val="TOC2"/>
         <w:rPr>
           <w:rFonts w:eastAsiaTheme="minorEastAsia"/>
           <w:smallCaps w:val="0"/>
@@ -5751,7 +5751,7 @@
       <w:hyperlink w:anchor="_Toc180586172" w:history="1">
         <w:r>
           <w:rPr>
-            <w:rStyle w:val="Hipervnculo"/>
+            <w:rStyle w:val="Hyperlink"/>
             <w:rFonts w:ascii="Tahoma" w:hAnsi="Tahoma" w:cs="Tahoma"/>
             <w:noProof/>
           </w:rPr>
@@ -5772,7 +5772,7 @@
         </w:r>
         <w:r>
           <w:rPr>
-            <w:rStyle w:val="Hipervnculo"/>
+            <w:rStyle w:val="Hyperlink"/>
             <w:rFonts w:ascii="Tahoma" w:hAnsi="Tahoma" w:cs="Tahoma"/>
             <w:noProof/>
           </w:rPr>
@@ -5830,7 +5830,7 @@
     </w:p>
     <w:p>
       <w:pPr>
-        <w:pStyle w:val="TDC1"/>
+        <w:pStyle w:val="TOC1"/>
         <w:tabs>
           <w:tab w:val="left" w:pos="1540"/>
           <w:tab w:val="right" w:leader="dot" w:pos="8494"/>
@@ -5851,7 +5851,7 @@
       <w:hyperlink w:anchor="_Toc180586173" w:history="1">
         <w:r>
           <w:rPr>
-            <w:rStyle w:val="Hipervnculo"/>
+            <w:rStyle w:val="Hyperlink"/>
             <w:rFonts w:ascii="Tahoma" w:hAnsi="Tahoma" w:cs="Tahoma"/>
             <w:noProof/>
           </w:rPr>
@@ -5874,7 +5874,7 @@
         </w:r>
         <w:r>
           <w:rPr>
-            <w:rStyle w:val="Hipervnculo"/>
+            <w:rStyle w:val="Hyperlink"/>
             <w:rFonts w:ascii="Tahoma" w:hAnsi="Tahoma" w:cs="Tahoma"/>
             <w:noProof/>
           </w:rPr>
@@ -5932,7 +5932,7 @@
     </w:p>
     <w:p>
       <w:pPr>
-        <w:pStyle w:val="TDC2"/>
+        <w:pStyle w:val="TOC2"/>
         <w:rPr>
           <w:rFonts w:eastAsiaTheme="minorEastAsia"/>
           <w:smallCaps w:val="0"/>
@@ -5947,7 +5947,7 @@
       <w:hyperlink w:anchor="_Toc180586174" w:history="1">
         <w:r>
           <w:rPr>
-            <w:rStyle w:val="Hipervnculo"/>
+            <w:rStyle w:val="Hyperlink"/>
             <w:rFonts w:ascii="Tahoma" w:hAnsi="Tahoma" w:cs="Tahoma"/>
             <w:noProof/>
           </w:rPr>
@@ -5968,7 +5968,7 @@
         </w:r>
         <w:r>
           <w:rPr>
-            <w:rStyle w:val="Hipervnculo"/>
+            <w:rStyle w:val="Hyperlink"/>
             <w:rFonts w:ascii="Tahoma" w:hAnsi="Tahoma" w:cs="Tahoma"/>
             <w:noProof/>
           </w:rPr>
@@ -6026,7 +6026,7 @@
     </w:p>
     <w:p>
       <w:pPr>
-        <w:pStyle w:val="TDC2"/>
+        <w:pStyle w:val="TOC2"/>
         <w:rPr>
           <w:rFonts w:eastAsiaTheme="minorEastAsia"/>
           <w:smallCaps w:val="0"/>
@@ -6041,7 +6041,7 @@
       <w:hyperlink w:anchor="_Toc180586175" w:history="1">
         <w:r>
           <w:rPr>
-            <w:rStyle w:val="Hipervnculo"/>
+            <w:rStyle w:val="Hyperlink"/>
             <w:rFonts w:ascii="Tahoma" w:hAnsi="Tahoma" w:cs="Tahoma"/>
             <w:noProof/>
           </w:rPr>
@@ -6062,7 +6062,7 @@
         </w:r>
         <w:r>
           <w:rPr>
-            <w:rStyle w:val="Hipervnculo"/>
+            <w:rStyle w:val="Hyperlink"/>
             <w:rFonts w:ascii="Tahoma" w:hAnsi="Tahoma" w:cs="Tahoma"/>
             <w:noProof/>
           </w:rPr>
@@ -6120,7 +6120,7 @@
     </w:p>
     <w:p>
       <w:pPr>
-        <w:pStyle w:val="TDC2"/>
+        <w:pStyle w:val="TOC2"/>
         <w:rPr>
           <w:rFonts w:eastAsiaTheme="minorEastAsia"/>
           <w:smallCaps w:val="0"/>
@@ -6135,7 +6135,7 @@
       <w:hyperlink w:anchor="_Toc180586176" w:history="1">
         <w:r>
           <w:rPr>
-            <w:rStyle w:val="Hipervnculo"/>
+            <w:rStyle w:val="Hyperlink"/>
             <w:rFonts w:ascii="Tahoma" w:hAnsi="Tahoma" w:cs="Tahoma"/>
             <w:noProof/>
           </w:rPr>
@@ -6156,7 +6156,7 @@
         </w:r>
         <w:r>
           <w:rPr>
-            <w:rStyle w:val="Hipervnculo"/>
+            <w:rStyle w:val="Hyperlink"/>
             <w:rFonts w:ascii="Tahoma" w:hAnsi="Tahoma" w:cs="Tahoma"/>
             <w:noProof/>
           </w:rPr>
@@ -6214,7 +6214,7 @@
     </w:p>
     <w:p>
       <w:pPr>
-        <w:pStyle w:val="TDC3"/>
+        <w:pStyle w:val="TOC3"/>
         <w:tabs>
           <w:tab w:val="left" w:pos="1320"/>
           <w:tab w:val="right" w:leader="dot" w:pos="8494"/>
@@ -6234,7 +6234,7 @@
       <w:hyperlink w:anchor="_Toc180586177" w:history="1">
         <w:r>
           <w:rPr>
-            <w:rStyle w:val="Hipervnculo"/>
+            <w:rStyle w:val="Hyperlink"/>
             <w:rFonts w:ascii="Tahoma" w:hAnsi="Tahoma" w:cs="Tahoma"/>
             <w:noProof/>
           </w:rPr>
@@ -6256,7 +6256,7 @@
         </w:r>
         <w:r>
           <w:rPr>
-            <w:rStyle w:val="Hipervnculo"/>
+            <w:rStyle w:val="Hyperlink"/>
             <w:rFonts w:ascii="Tahoma" w:hAnsi="Tahoma" w:cs="Tahoma"/>
             <w:noProof/>
           </w:rPr>
@@ -6314,7 +6314,7 @@
     </w:p>
     <w:p>
       <w:pPr>
-        <w:pStyle w:val="TDC3"/>
+        <w:pStyle w:val="TOC3"/>
         <w:tabs>
           <w:tab w:val="left" w:pos="1320"/>
           <w:tab w:val="right" w:leader="dot" w:pos="8494"/>
@@ -6334,7 +6334,7 @@
       <w:hyperlink w:anchor="_Toc180586178" w:history="1">
         <w:r>
           <w:rPr>
-            <w:rStyle w:val="Hipervnculo"/>
+            <w:rStyle w:val="Hyperlink"/>
             <w:rFonts w:ascii="Tahoma" w:hAnsi="Tahoma" w:cs="Tahoma"/>
             <w:noProof/>
           </w:rPr>
@@ -6356,7 +6356,7 @@
         </w:r>
         <w:r>
           <w:rPr>
-            <w:rStyle w:val="Hipervnculo"/>
+            <w:rStyle w:val="Hyperlink"/>
             <w:rFonts w:ascii="Tahoma" w:hAnsi="Tahoma" w:cs="Tahoma"/>
             <w:noProof/>
           </w:rPr>
@@ -6414,7 +6414,7 @@
     </w:p>
     <w:p>
       <w:pPr>
-        <w:pStyle w:val="TDC2"/>
+        <w:pStyle w:val="TOC2"/>
         <w:rPr>
           <w:rFonts w:eastAsiaTheme="minorEastAsia"/>
           <w:smallCaps w:val="0"/>
@@ -6429,7 +6429,7 @@
       <w:hyperlink w:anchor="_Toc180586179" w:history="1">
         <w:r>
           <w:rPr>
-            <w:rStyle w:val="Hipervnculo"/>
+            <w:rStyle w:val="Hyperlink"/>
             <w:rFonts w:ascii="Tahoma" w:hAnsi="Tahoma" w:cs="Tahoma"/>
             <w:noProof/>
           </w:rPr>
@@ -6450,7 +6450,7 @@
         </w:r>
         <w:r>
           <w:rPr>
-            <w:rStyle w:val="Hipervnculo"/>
+            <w:rStyle w:val="Hyperlink"/>
             <w:rFonts w:ascii="Tahoma" w:hAnsi="Tahoma" w:cs="Tahoma"/>
             <w:noProof/>
           </w:rPr>
@@ -6508,7 +6508,7 @@
     </w:p>
     <w:p>
       <w:pPr>
-        <w:pStyle w:val="TDC3"/>
+        <w:pStyle w:val="TOC3"/>
         <w:tabs>
           <w:tab w:val="left" w:pos="1320"/>
           <w:tab w:val="right" w:leader="dot" w:pos="8494"/>
@@ -6528,7 +6528,7 @@
       <w:hyperlink w:anchor="_Toc180586180" w:history="1">
         <w:r>
           <w:rPr>
-            <w:rStyle w:val="Hipervnculo"/>
+            <w:rStyle w:val="Hyperlink"/>
             <w:rFonts w:ascii="Tahoma" w:hAnsi="Tahoma" w:cs="Tahoma"/>
             <w:noProof/>
           </w:rPr>
@@ -6550,7 +6550,7 @@
         </w:r>
         <w:r>
           <w:rPr>
-            <w:rStyle w:val="Hipervnculo"/>
+            <w:rStyle w:val="Hyperlink"/>
             <w:rFonts w:ascii="Tahoma" w:hAnsi="Tahoma" w:cs="Tahoma"/>
             <w:noProof/>
           </w:rPr>
@@ -6608,7 +6608,7 @@
     </w:p>
     <w:p>
       <w:pPr>
-        <w:pStyle w:val="TDC1"/>
+        <w:pStyle w:val="TOC1"/>
         <w:tabs>
           <w:tab w:val="left" w:pos="1540"/>
           <w:tab w:val="right" w:leader="dot" w:pos="8494"/>
@@ -6629,7 +6629,7 @@
       <w:hyperlink w:anchor="_Toc180586181" w:history="1">
         <w:r>
           <w:rPr>
-            <w:rStyle w:val="Hipervnculo"/>
+            <w:rStyle w:val="Hyperlink"/>
             <w:rFonts w:ascii="Tahoma" w:hAnsi="Tahoma" w:cs="Tahoma"/>
             <w:noProof/>
           </w:rPr>
@@ -6652,7 +6652,7 @@
         </w:r>
         <w:r>
           <w:rPr>
-            <w:rStyle w:val="Hipervnculo"/>
+            <w:rStyle w:val="Hyperlink"/>
             <w:rFonts w:ascii="Tahoma" w:hAnsi="Tahoma" w:cs="Tahoma"/>
             <w:noProof/>
           </w:rPr>
@@ -6710,7 +6710,7 @@
     </w:p>
     <w:p>
       <w:pPr>
-        <w:pStyle w:val="TDC2"/>
+        <w:pStyle w:val="TOC2"/>
         <w:rPr>
           <w:rFonts w:eastAsiaTheme="minorEastAsia"/>
           <w:smallCaps w:val="0"/>
@@ -6725,7 +6725,7 @@
       <w:hyperlink w:anchor="_Toc180586182" w:history="1">
         <w:r>
           <w:rPr>
-            <w:rStyle w:val="Hipervnculo"/>
+            <w:rStyle w:val="Hyperlink"/>
             <w:rFonts w:ascii="Tahoma" w:hAnsi="Tahoma" w:cs="Tahoma"/>
             <w:noProof/>
           </w:rPr>
@@ -6746,7 +6746,7 @@
         </w:r>
         <w:r>
           <w:rPr>
-            <w:rStyle w:val="Hipervnculo"/>
+            <w:rStyle w:val="Hyperlink"/>
             <w:rFonts w:ascii="Tahoma" w:hAnsi="Tahoma" w:cs="Tahoma"/>
             <w:noProof/>
           </w:rPr>
@@ -6804,7 +6804,7 @@
     </w:p>
     <w:p>
       <w:pPr>
-        <w:pStyle w:val="TDC2"/>
+        <w:pStyle w:val="TOC2"/>
         <w:rPr>
           <w:rFonts w:eastAsiaTheme="minorEastAsia"/>
           <w:smallCaps w:val="0"/>
@@ -6819,7 +6819,7 @@
       <w:hyperlink w:anchor="_Toc180586183" w:history="1">
         <w:r>
           <w:rPr>
-            <w:rStyle w:val="Hipervnculo"/>
+            <w:rStyle w:val="Hyperlink"/>
             <w:rFonts w:ascii="Tahoma" w:hAnsi="Tahoma" w:cs="Tahoma"/>
             <w:noProof/>
           </w:rPr>
@@ -6840,7 +6840,7 @@
         </w:r>
         <w:r>
           <w:rPr>
-            <w:rStyle w:val="Hipervnculo"/>
+            <w:rStyle w:val="Hyperlink"/>
             <w:rFonts w:ascii="Tahoma" w:hAnsi="Tahoma" w:cs="Tahoma"/>
             <w:noProof/>
           </w:rPr>
@@ -6898,7 +6898,7 @@
     </w:p>
     <w:p>
       <w:pPr>
-        <w:pStyle w:val="TDC1"/>
+        <w:pStyle w:val="TOC1"/>
         <w:tabs>
           <w:tab w:val="left" w:pos="1540"/>
           <w:tab w:val="right" w:leader="dot" w:pos="8494"/>
@@ -6919,7 +6919,7 @@
       <w:hyperlink w:anchor="_Toc180586184" w:history="1">
         <w:r>
           <w:rPr>
-            <w:rStyle w:val="Hipervnculo"/>
+            <w:rStyle w:val="Hyperlink"/>
             <w:rFonts w:ascii="Tahoma" w:hAnsi="Tahoma" w:cs="Tahoma"/>
             <w:noProof/>
           </w:rPr>
@@ -6942,7 +6942,7 @@
         </w:r>
         <w:r>
           <w:rPr>
-            <w:rStyle w:val="Hipervnculo"/>
+            <w:rStyle w:val="Hyperlink"/>
             <w:rFonts w:ascii="Tahoma" w:hAnsi="Tahoma" w:cs="Tahoma"/>
             <w:noProof/>
           </w:rPr>
@@ -7000,7 +7000,7 @@
     </w:p>
     <w:p>
       <w:pPr>
-        <w:pStyle w:val="TDC2"/>
+        <w:pStyle w:val="TOC2"/>
         <w:rPr>
           <w:rFonts w:eastAsiaTheme="minorEastAsia"/>
           <w:smallCaps w:val="0"/>
@@ -7015,7 +7015,7 @@
       <w:hyperlink w:anchor="_Toc180586185" w:history="1">
         <w:r>
           <w:rPr>
-            <w:rStyle w:val="Hipervnculo"/>
+            <w:rStyle w:val="Hyperlink"/>
             <w:rFonts w:ascii="Tahoma" w:hAnsi="Tahoma" w:cs="Tahoma"/>
             <w:noProof/>
           </w:rPr>
@@ -7036,7 +7036,7 @@
         </w:r>
         <w:r>
           <w:rPr>
-            <w:rStyle w:val="Hipervnculo"/>
+            <w:rStyle w:val="Hyperlink"/>
             <w:rFonts w:ascii="Tahoma" w:hAnsi="Tahoma" w:cs="Tahoma"/>
             <w:noProof/>
           </w:rPr>
@@ -7094,7 +7094,7 @@
     </w:p>
     <w:p>
       <w:pPr>
-        <w:pStyle w:val="TDC2"/>
+        <w:pStyle w:val="TOC2"/>
         <w:rPr>
           <w:rFonts w:eastAsiaTheme="minorEastAsia"/>
           <w:smallCaps w:val="0"/>
@@ -7109,7 +7109,7 @@
       <w:hyperlink w:anchor="_Toc180586186" w:history="1">
         <w:r>
           <w:rPr>
-            <w:rStyle w:val="Hipervnculo"/>
+            <w:rStyle w:val="Hyperlink"/>
             <w:rFonts w:ascii="Tahoma" w:hAnsi="Tahoma" w:cs="Tahoma"/>
             <w:noProof/>
           </w:rPr>
@@ -7130,7 +7130,7 @@
         </w:r>
         <w:r>
           <w:rPr>
-            <w:rStyle w:val="Hipervnculo"/>
+            <w:rStyle w:val="Hyperlink"/>
             <w:rFonts w:ascii="Tahoma" w:hAnsi="Tahoma" w:cs="Tahoma"/>
             <w:noProof/>
           </w:rPr>
@@ -7188,7 +7188,7 @@
     </w:p>
     <w:p>
       <w:pPr>
-        <w:pStyle w:val="TDC1"/>
+        <w:pStyle w:val="TOC1"/>
         <w:tabs>
           <w:tab w:val="left" w:pos="1760"/>
           <w:tab w:val="right" w:leader="dot" w:pos="8494"/>
@@ -7209,7 +7209,7 @@
       <w:hyperlink w:anchor="_Toc180586187" w:history="1">
         <w:r>
           <w:rPr>
-            <w:rStyle w:val="Hipervnculo"/>
+            <w:rStyle w:val="Hyperlink"/>
             <w:rFonts w:ascii="Tahoma" w:hAnsi="Tahoma" w:cs="Tahoma"/>
             <w:noProof/>
           </w:rPr>
@@ -7232,7 +7232,7 @@
         </w:r>
         <w:r>
           <w:rPr>
-            <w:rStyle w:val="Hipervnculo"/>
+            <w:rStyle w:val="Hyperlink"/>
             <w:rFonts w:ascii="Tahoma" w:hAnsi="Tahoma" w:cs="Tahoma"/>
             <w:noProof/>
           </w:rPr>
@@ -7290,7 +7290,7 @@
     </w:p>
     <w:p>
       <w:pPr>
-        <w:pStyle w:val="TDC2"/>
+        <w:pStyle w:val="TOC2"/>
         <w:rPr>
           <w:rFonts w:eastAsiaTheme="minorEastAsia"/>
           <w:smallCaps w:val="0"/>
@@ -7305,7 +7305,7 @@
       <w:hyperlink w:anchor="_Toc180586188" w:history="1">
         <w:r>
           <w:rPr>
-            <w:rStyle w:val="Hipervnculo"/>
+            <w:rStyle w:val="Hyperlink"/>
             <w:rFonts w:ascii="Tahoma" w:hAnsi="Tahoma" w:cs="Tahoma"/>
             <w:noProof/>
           </w:rPr>
@@ -7326,7 +7326,7 @@
         </w:r>
         <w:r>
           <w:rPr>
-            <w:rStyle w:val="Hipervnculo"/>
+            <w:rStyle w:val="Hyperlink"/>
             <w:rFonts w:ascii="Tahoma" w:hAnsi="Tahoma" w:cs="Tahoma"/>
             <w:noProof/>
           </w:rPr>
@@ -7423,7 +7423,7 @@
     </w:p>
     <w:p>
       <w:pPr>
-        <w:pStyle w:val="Ttulo1"/>
+        <w:pStyle w:val="Heading1"/>
         <w:pBdr>
           <w:bottom w:val="single" w:sz="4" w:space="1" w:color="auto"/>
           <w:right w:val="single" w:sz="4" w:space="4" w:color="auto"/>
@@ -7465,7 +7465,7 @@
     </w:p>
     <w:p>
       <w:pPr>
-        <w:pStyle w:val="Ttulo2"/>
+        <w:pStyle w:val="Heading2"/>
         <w:rPr>
           <w:rFonts w:ascii="Tahoma" w:hAnsi="Tahoma" w:cs="Tahoma"/>
         </w:rPr>
@@ -7538,7 +7538,7 @@
     </w:p>
     <w:p>
       <w:pPr>
-        <w:pStyle w:val="Ttulo2"/>
+        <w:pStyle w:val="Heading2"/>
         <w:rPr>
           <w:rFonts w:ascii="Tahoma" w:hAnsi="Tahoma" w:cs="Tahoma"/>
         </w:rPr>
@@ -7646,7 +7646,7 @@
     </w:p>
     <w:p>
       <w:pPr>
-        <w:pStyle w:val="Ttulo1"/>
+        <w:pStyle w:val="Heading1"/>
         <w:pBdr>
           <w:bottom w:val="single" w:sz="4" w:space="1" w:color="auto"/>
           <w:right w:val="single" w:sz="4" w:space="4" w:color="auto"/>
@@ -7672,7 +7672,7 @@
     </w:p>
     <w:p>
       <w:pPr>
-        <w:pStyle w:val="Ttulo2"/>
+        <w:pStyle w:val="Heading2"/>
         <w:rPr>
           <w:rFonts w:ascii="Tahoma" w:hAnsi="Tahoma" w:cs="Tahoma"/>
         </w:rPr>
@@ -7761,7 +7761,7 @@
     </w:p>
     <w:p>
       <w:pPr>
-        <w:pStyle w:val="Ttulo2"/>
+        <w:pStyle w:val="Heading2"/>
         <w:rPr>
           <w:rFonts w:ascii="Tahoma" w:hAnsi="Tahoma" w:cs="Tahoma"/>
         </w:rPr>
@@ -7959,7 +7959,7 @@
     </w:p>
     <w:p>
       <w:pPr>
-        <w:pStyle w:val="Ttulo1"/>
+        <w:pStyle w:val="Heading1"/>
         <w:pBdr>
           <w:bottom w:val="single" w:sz="4" w:space="1" w:color="auto"/>
           <w:right w:val="single" w:sz="4" w:space="4" w:color="auto"/>
@@ -8001,7 +8001,7 @@
     </w:p>
     <w:p>
       <w:pPr>
-        <w:pStyle w:val="Ttulo2"/>
+        <w:pStyle w:val="Heading2"/>
         <w:rPr>
           <w:rFonts w:ascii="Tahoma" w:hAnsi="Tahoma" w:cs="Tahoma"/>
         </w:rPr>
@@ -8080,7 +8080,7 @@
     </w:p>
     <w:p>
       <w:pPr>
-        <w:pStyle w:val="Ttulo2"/>
+        <w:pStyle w:val="Heading2"/>
         <w:rPr>
           <w:rFonts w:ascii="Tahoma" w:hAnsi="Tahoma" w:cs="Tahoma"/>
         </w:rPr>
@@ -8136,7 +8136,7 @@
     </w:p>
     <w:p>
       <w:pPr>
-        <w:pStyle w:val="Ttulo2"/>
+        <w:pStyle w:val="Heading2"/>
         <w:rPr>
           <w:rFonts w:ascii="Tahoma" w:hAnsi="Tahoma" w:cs="Tahoma"/>
         </w:rPr>
@@ -8237,7 +8237,7 @@
     </w:p>
     <w:p>
       <w:pPr>
-        <w:pStyle w:val="Ttulo2"/>
+        <w:pStyle w:val="Heading2"/>
         <w:rPr>
           <w:rFonts w:ascii="Tahoma" w:hAnsi="Tahoma" w:cs="Tahoma"/>
         </w:rPr>
@@ -8273,7 +8273,7 @@
     </w:p>
     <w:p>
       <w:pPr>
-        <w:pStyle w:val="Ttulo1"/>
+        <w:pStyle w:val="Heading1"/>
         <w:pBdr>
           <w:bottom w:val="single" w:sz="4" w:space="1" w:color="auto"/>
           <w:right w:val="single" w:sz="4" w:space="4" w:color="auto"/>
@@ -8299,7 +8299,7 @@
     </w:p>
     <w:p>
       <w:pPr>
-        <w:pStyle w:val="Ttulo2"/>
+        <w:pStyle w:val="Heading2"/>
         <w:rPr>
           <w:rFonts w:ascii="Tahoma" w:hAnsi="Tahoma" w:cs="Tahoma"/>
         </w:rPr>
@@ -8327,7 +8327,7 @@
     </w:p>
     <w:p>
       <w:pPr>
-        <w:pStyle w:val="Ttulo3"/>
+        <w:pStyle w:val="Heading3"/>
         <w:rPr>
           <w:rFonts w:ascii="Tahoma" w:hAnsi="Tahoma" w:cs="Tahoma"/>
         </w:rPr>
@@ -8439,7 +8439,7 @@
     </w:p>
     <w:p>
       <w:pPr>
-        <w:pStyle w:val="Ttulo2"/>
+        <w:pStyle w:val="Heading2"/>
         <w:rPr>
           <w:rFonts w:ascii="Tahoma" w:hAnsi="Tahoma" w:cs="Tahoma"/>
         </w:rPr>
@@ -8462,7 +8462,7 @@
     </w:p>
     <w:p>
       <w:pPr>
-        <w:pStyle w:val="Ttulo3"/>
+        <w:pStyle w:val="Heading3"/>
         <w:rPr>
           <w:rFonts w:ascii="Tahoma" w:hAnsi="Tahoma" w:cs="Tahoma"/>
         </w:rPr>
@@ -8610,7 +8610,7 @@
     </w:p>
     <w:p>
       <w:pPr>
-        <w:pStyle w:val="Ttulo3"/>
+        <w:pStyle w:val="Heading3"/>
         <w:rPr>
           <w:rFonts w:ascii="Tahoma" w:hAnsi="Tahoma" w:cs="Tahoma"/>
         </w:rPr>
@@ -10040,7 +10040,7 @@
     </w:p>
     <w:p>
       <w:pPr>
-        <w:pStyle w:val="Ttulo2"/>
+        <w:pStyle w:val="Heading2"/>
         <w:rPr>
           <w:rFonts w:ascii="Tahoma" w:hAnsi="Tahoma" w:cs="Tahoma"/>
         </w:rPr>
@@ -10153,7 +10153,7 @@
     </w:p>
     <w:p>
       <w:pPr>
-        <w:pStyle w:val="Ttulo2"/>
+        <w:pStyle w:val="Heading2"/>
         <w:rPr>
           <w:rFonts w:ascii="Tahoma" w:hAnsi="Tahoma" w:cs="Tahoma"/>
         </w:rPr>
@@ -10239,9 +10239,9 @@
           <w:lang w:eastAsia="es-ES"/>
         </w:rPr>
         <w:drawing>
-          <wp:inline distT="0" distB="0" distL="0" distR="0" wp14:anchorId="7B228869" wp14:editId="76D814FC">
-            <wp:extent cx="3048264" cy="6607113"/>
-            <wp:effectExtent l="0" t="0" r="0" b="3810"/>
+          <wp:inline distT="0" distB="0" distL="0" distR="0" wp14:anchorId="7B228869" wp14:editId="3F632B92">
+            <wp:extent cx="2051085" cy="4445727"/>
+            <wp:effectExtent l="0" t="0" r="0" b="0"/>
             <wp:docPr id="182401123" name="Picture 1"/>
             <wp:cNvGraphicFramePr>
               <a:graphicFrameLocks xmlns:a="http://schemas.openxmlformats.org/drawingml/2006/main" noChangeAspect="1"/>
@@ -10262,7 +10262,7 @@
                   <pic:spPr>
                     <a:xfrm>
                       <a:off x="0" y="0"/>
-                      <a:ext cx="3048264" cy="6607113"/>
+                      <a:ext cx="2057184" cy="4458947"/>
                     </a:xfrm>
                     <a:prstGeom prst="rect">
                       <a:avLst/>
@@ -10302,26 +10302,77 @@
       <w:r>
         <w:rPr>
           <w:rFonts w:ascii="Tahoma" w:hAnsi="Tahoma" w:cs="Tahoma"/>
-          <w:lang w:eastAsia="es-ES"/>
-        </w:rPr>
-        <w:t>CU-04 Aplicar a Oferta: El candidato se inscribe en una vacante.</w:t>
-      </w:r>
-    </w:p>
-    <w:p>
-      <w:pPr>
-        <w:jc w:val="left"/>
-        <w:rPr>
-          <w:rFonts w:ascii="Tahoma" w:hAnsi="Tahoma" w:cs="Tahoma"/>
-          <w:lang w:eastAsia="es-ES"/>
-        </w:rPr>
-      </w:pPr>
-      <w:r>
-        <w:rPr>
-          <w:rFonts w:ascii="Tahoma" w:hAnsi="Tahoma" w:cs="Tahoma"/>
           <w:noProof/>
           <w:lang w:eastAsia="es-ES"/>
         </w:rPr>
+        <w:drawing>
+          <wp:inline distT="0" distB="0" distL="0" distR="0" wp14:anchorId="7AF4A14C" wp14:editId="15DCD893">
+            <wp:extent cx="3687911" cy="2627159"/>
+            <wp:effectExtent l="0" t="0" r="0" b="0"/>
+            <wp:docPr id="1380820445" name="Picture 1"/>
+            <wp:cNvGraphicFramePr>
+              <a:graphicFrameLocks xmlns:a="http://schemas.openxmlformats.org/drawingml/2006/main" noChangeAspect="1"/>
+            </wp:cNvGraphicFramePr>
+            <a:graphic xmlns:a="http://schemas.openxmlformats.org/drawingml/2006/main">
+              <a:graphicData uri="http://schemas.openxmlformats.org/drawingml/2006/picture">
+                <pic:pic xmlns:pic="http://schemas.openxmlformats.org/drawingml/2006/picture">
+                  <pic:nvPicPr>
+                    <pic:cNvPr id="1380820445" name=""/>
+                    <pic:cNvPicPr/>
+                  </pic:nvPicPr>
+                  <pic:blipFill>
+                    <a:blip r:embed="rId11"/>
+                    <a:stretch>
+                      <a:fillRect/>
+                    </a:stretch>
+                  </pic:blipFill>
+                  <pic:spPr>
+                    <a:xfrm>
+                      <a:off x="0" y="0"/>
+                      <a:ext cx="3704388" cy="2638897"/>
+                    </a:xfrm>
+                    <a:prstGeom prst="rect">
+                      <a:avLst/>
+                    </a:prstGeom>
+                  </pic:spPr>
+                </pic:pic>
+              </a:graphicData>
+            </a:graphic>
+          </wp:inline>
+        </w:drawing>
+      </w:r>
+    </w:p>
+    <w:p>
+      <w:pPr>
+        <w:jc w:val="left"/>
+        <w:rPr>
+          <w:rFonts w:ascii="Tahoma" w:hAnsi="Tahoma" w:cs="Tahoma"/>
+          <w:lang w:eastAsia="es-ES"/>
+        </w:rPr>
+      </w:pPr>
+      <w:r>
+        <w:rPr>
+          <w:rFonts w:ascii="Tahoma" w:hAnsi="Tahoma" w:cs="Tahoma"/>
+          <w:lang w:eastAsia="es-ES"/>
+        </w:rPr>
         <w:lastRenderedPageBreak/>
+        <w:t>CU-04 Aplicar a Oferta: El candidato se inscribe en una vacante.</w:t>
+      </w:r>
+    </w:p>
+    <w:p>
+      <w:pPr>
+        <w:jc w:val="left"/>
+        <w:rPr>
+          <w:rFonts w:ascii="Tahoma" w:hAnsi="Tahoma" w:cs="Tahoma"/>
+          <w:lang w:eastAsia="es-ES"/>
+        </w:rPr>
+      </w:pPr>
+      <w:r>
+        <w:rPr>
+          <w:rFonts w:ascii="Tahoma" w:hAnsi="Tahoma" w:cs="Tahoma"/>
+          <w:noProof/>
+          <w:lang w:eastAsia="es-ES"/>
+        </w:rPr>
         <w:drawing>
           <wp:inline distT="0" distB="0" distL="0" distR="0" wp14:anchorId="47E75115" wp14:editId="101E7576">
             <wp:extent cx="3779848" cy="7079593"/>
@@ -10338,7 +10389,7 @@
                     <pic:cNvPicPr/>
                   </pic:nvPicPr>
                   <pic:blipFill>
-                    <a:blip r:embed="rId11"/>
+                    <a:blip r:embed="rId12"/>
                     <a:stretch>
                       <a:fillRect/>
                     </a:stretch>
@@ -10383,7 +10434,7 @@
     </w:p>
     <w:p>
       <w:pPr>
-        <w:pStyle w:val="Ttulo2"/>
+        <w:pStyle w:val="Heading2"/>
         <w:rPr>
           <w:rFonts w:ascii="Tahoma" w:hAnsi="Tahoma" w:cs="Tahoma"/>
         </w:rPr>
@@ -10481,7 +10532,7 @@
                     <pic:cNvPicPr/>
                   </pic:nvPicPr>
                   <pic:blipFill>
-                    <a:blip r:embed="rId12"/>
+                    <a:blip r:embed="rId13"/>
                     <a:stretch>
                       <a:fillRect/>
                     </a:stretch>
@@ -10510,7 +10561,7 @@
     </w:p>
     <w:p>
       <w:pPr>
-        <w:pStyle w:val="Ttulo2"/>
+        <w:pStyle w:val="Heading2"/>
         <w:rPr>
           <w:rFonts w:ascii="Tahoma" w:hAnsi="Tahoma" w:cs="Tahoma"/>
         </w:rPr>
@@ -10740,7 +10791,7 @@
     </w:p>
     <w:p>
       <w:pPr>
-        <w:pStyle w:val="Ttulo1"/>
+        <w:pStyle w:val="Heading1"/>
         <w:pBdr>
           <w:bottom w:val="single" w:sz="4" w:space="1" w:color="auto"/>
           <w:right w:val="single" w:sz="4" w:space="4" w:color="auto"/>
@@ -10766,7 +10817,7 @@
     </w:p>
     <w:p>
       <w:pPr>
-        <w:pStyle w:val="Ttulo2"/>
+        <w:pStyle w:val="Heading2"/>
         <w:rPr>
           <w:rFonts w:ascii="Tahoma" w:hAnsi="Tahoma" w:cs="Tahoma"/>
         </w:rPr>
@@ -10821,7 +10872,7 @@
     </w:p>
     <w:p>
       <w:pPr>
-        <w:pStyle w:val="Prrafodelista"/>
+        <w:pStyle w:val="ListParagraph"/>
         <w:numPr>
           <w:ilvl w:val="0"/>
           <w:numId w:val="3"/>
@@ -10843,7 +10894,7 @@
     </w:p>
     <w:p>
       <w:pPr>
-        <w:pStyle w:val="Prrafodelista"/>
+        <w:pStyle w:val="ListParagraph"/>
         <w:numPr>
           <w:ilvl w:val="0"/>
           <w:numId w:val="3"/>
@@ -10872,7 +10923,7 @@
     </w:p>
     <w:p>
       <w:pPr>
-        <w:pStyle w:val="Ttulo2"/>
+        <w:pStyle w:val="Heading2"/>
         <w:ind w:left="737" w:hanging="737"/>
         <w:rPr>
           <w:rFonts w:ascii="Tahoma" w:hAnsi="Tahoma" w:cs="Tahoma"/>
@@ -10915,7 +10966,7 @@
     </w:p>
     <w:p>
       <w:pPr>
-        <w:pStyle w:val="Prrafodelista"/>
+        <w:pStyle w:val="ListParagraph"/>
         <w:numPr>
           <w:ilvl w:val="0"/>
           <w:numId w:val="3"/>
@@ -10937,7 +10988,7 @@
     </w:p>
     <w:p>
       <w:pPr>
-        <w:pStyle w:val="Prrafodelista"/>
+        <w:pStyle w:val="ListParagraph"/>
         <w:numPr>
           <w:ilvl w:val="0"/>
           <w:numId w:val="3"/>
@@ -10959,7 +11010,7 @@
     </w:p>
     <w:p>
       <w:pPr>
-        <w:pStyle w:val="Prrafodelista"/>
+        <w:pStyle w:val="ListParagraph"/>
         <w:numPr>
           <w:ilvl w:val="0"/>
           <w:numId w:val="3"/>
@@ -10981,7 +11032,7 @@
     </w:p>
     <w:p>
       <w:pPr>
-        <w:pStyle w:val="Prrafodelista"/>
+        <w:pStyle w:val="ListParagraph"/>
         <w:numPr>
           <w:ilvl w:val="0"/>
           <w:numId w:val="3"/>
@@ -11003,7 +11054,7 @@
     </w:p>
     <w:p>
       <w:pPr>
-        <w:pStyle w:val="Prrafodelista"/>
+        <w:pStyle w:val="ListParagraph"/>
         <w:numPr>
           <w:ilvl w:val="0"/>
           <w:numId w:val="3"/>
@@ -11025,7 +11076,7 @@
     </w:p>
     <w:p>
       <w:pPr>
-        <w:pStyle w:val="Prrafodelista"/>
+        <w:pStyle w:val="ListParagraph"/>
         <w:numPr>
           <w:ilvl w:val="0"/>
           <w:numId w:val="3"/>
@@ -11047,7 +11098,7 @@
     </w:p>
     <w:p>
       <w:pPr>
-        <w:pStyle w:val="Prrafodelista"/>
+        <w:pStyle w:val="ListParagraph"/>
         <w:numPr>
           <w:ilvl w:val="0"/>
           <w:numId w:val="3"/>
@@ -11105,7 +11156,7 @@
     </w:p>
     <w:p>
       <w:pPr>
-        <w:pStyle w:val="Ttulo3"/>
+        <w:pStyle w:val="Heading3"/>
         <w:rPr>
           <w:rFonts w:ascii="Tahoma" w:hAnsi="Tahoma" w:cs="Tahoma"/>
         </w:rPr>
@@ -11121,7 +11172,7 @@
     </w:p>
     <w:tbl>
       <w:tblPr>
-        <w:tblStyle w:val="Tablaconcuadrcula"/>
+        <w:tblStyle w:val="TableGrid"/>
         <w:tblW w:w="0" w:type="auto"/>
         <w:tblBorders>
           <w:top w:val="none" w:sz="0" w:space="0" w:color="auto"/>
@@ -11292,7 +11343,7 @@
     </w:tbl>
     <w:p>
       <w:pPr>
-        <w:pStyle w:val="Ttulo3"/>
+        <w:pStyle w:val="Heading3"/>
         <w:rPr>
           <w:rFonts w:ascii="Tahoma" w:hAnsi="Tahoma" w:cs="Tahoma"/>
         </w:rPr>
@@ -11309,7 +11360,7 @@
     </w:p>
     <w:tbl>
       <w:tblPr>
-        <w:tblStyle w:val="Tablaconcuadrcula"/>
+        <w:tblStyle w:val="TableGrid"/>
         <w:tblW w:w="0" w:type="auto"/>
         <w:tblBorders>
           <w:top w:val="none" w:sz="0" w:space="0" w:color="auto"/>
@@ -11480,7 +11531,7 @@
     </w:tbl>
     <w:p>
       <w:pPr>
-        <w:pStyle w:val="Ttulo3"/>
+        <w:pStyle w:val="Heading3"/>
         <w:rPr>
           <w:rFonts w:ascii="Tahoma" w:hAnsi="Tahoma" w:cs="Tahoma"/>
         </w:rPr>
@@ -11496,7 +11547,7 @@
     </w:p>
     <w:tbl>
       <w:tblPr>
-        <w:tblStyle w:val="Tablaconcuadrcula"/>
+        <w:tblStyle w:val="TableGrid"/>
         <w:tblW w:w="0" w:type="auto"/>
         <w:tblBorders>
           <w:top w:val="none" w:sz="0" w:space="0" w:color="auto"/>
@@ -11667,7 +11718,7 @@
     </w:tbl>
     <w:p>
       <w:pPr>
-        <w:pStyle w:val="Ttulo3"/>
+        <w:pStyle w:val="Heading3"/>
         <w:rPr>
           <w:rFonts w:ascii="Tahoma" w:hAnsi="Tahoma" w:cs="Tahoma"/>
         </w:rPr>
@@ -11890,7 +11941,7 @@
     </w:tbl>
     <w:p>
       <w:pPr>
-        <w:pStyle w:val="Ttulo3"/>
+        <w:pStyle w:val="Heading3"/>
         <w:rPr>
           <w:rFonts w:ascii="Tahoma" w:hAnsi="Tahoma" w:cs="Tahoma"/>
         </w:rPr>
@@ -11906,7 +11957,7 @@
     </w:p>
     <w:tbl>
       <w:tblPr>
-        <w:tblStyle w:val="Tablaconcuadrcula"/>
+        <w:tblStyle w:val="TableGrid"/>
         <w:tblW w:w="0" w:type="auto"/>
         <w:tblBorders>
           <w:top w:val="none" w:sz="0" w:space="0" w:color="auto"/>
@@ -12077,7 +12128,7 @@
     </w:tbl>
     <w:p>
       <w:pPr>
-        <w:pStyle w:val="Ttulo3"/>
+        <w:pStyle w:val="Heading3"/>
         <w:numPr>
           <w:ilvl w:val="0"/>
           <w:numId w:val="0"/>
@@ -12092,7 +12143,7 @@
     <w:p/>
     <w:p>
       <w:pPr>
-        <w:pStyle w:val="Ttulo3"/>
+        <w:pStyle w:val="Heading3"/>
         <w:rPr>
           <w:rFonts w:ascii="Tahoma" w:hAnsi="Tahoma" w:cs="Tahoma"/>
         </w:rPr>
@@ -12114,7 +12165,7 @@
     </w:p>
     <w:tbl>
       <w:tblPr>
-        <w:tblStyle w:val="Tablaconcuadrcula"/>
+        <w:tblStyle w:val="TableGrid"/>
         <w:tblW w:w="0" w:type="auto"/>
         <w:tblBorders>
           <w:top w:val="none" w:sz="0" w:space="0" w:color="auto"/>
@@ -12305,7 +12356,7 @@
     </w:tbl>
     <w:p>
       <w:pPr>
-        <w:pStyle w:val="Ttulo3"/>
+        <w:pStyle w:val="Heading3"/>
         <w:rPr>
           <w:rFonts w:ascii="Tahoma" w:hAnsi="Tahoma" w:cs="Tahoma"/>
         </w:rPr>
@@ -12321,7 +12372,7 @@
     </w:p>
     <w:tbl>
       <w:tblPr>
-        <w:tblStyle w:val="Tablaconcuadrcula"/>
+        <w:tblStyle w:val="TableGrid"/>
         <w:tblW w:w="0" w:type="auto"/>
         <w:tblBorders>
           <w:top w:val="none" w:sz="0" w:space="0" w:color="auto"/>
@@ -12482,7 +12533,7 @@
     </w:tbl>
     <w:p>
       <w:pPr>
-        <w:pStyle w:val="Ttulo2"/>
+        <w:pStyle w:val="Heading2"/>
         <w:rPr>
           <w:rFonts w:ascii="Tahoma" w:hAnsi="Tahoma" w:cs="Tahoma"/>
         </w:rPr>
@@ -12527,7 +12578,7 @@
     </w:p>
     <w:p>
       <w:pPr>
-        <w:pStyle w:val="Ttulo1"/>
+        <w:pStyle w:val="Heading1"/>
         <w:pBdr>
           <w:bottom w:val="single" w:sz="4" w:space="1" w:color="auto"/>
           <w:right w:val="single" w:sz="4" w:space="4" w:color="auto"/>
@@ -12569,7 +12620,7 @@
     </w:p>
     <w:p>
       <w:pPr>
-        <w:pStyle w:val="Ttulo2"/>
+        <w:pStyle w:val="Heading2"/>
         <w:rPr>
           <w:rFonts w:ascii="Tahoma" w:hAnsi="Tahoma" w:cs="Tahoma"/>
         </w:rPr>
@@ -12597,7 +12648,7 @@
     </w:p>
     <w:p>
       <w:pPr>
-        <w:pStyle w:val="Ttulo3"/>
+        <w:pStyle w:val="Heading3"/>
         <w:rPr>
           <w:rFonts w:ascii="Tahoma" w:hAnsi="Tahoma" w:cs="Tahoma"/>
         </w:rPr>
@@ -12649,7 +12700,7 @@
                     <pic:cNvPicPr/>
                   </pic:nvPicPr>
                   <pic:blipFill>
-                    <a:blip r:embed="rId13"/>
+                    <a:blip r:embed="rId14"/>
                     <a:stretch>
                       <a:fillRect/>
                     </a:stretch>
@@ -12695,7 +12746,7 @@
                     <pic:cNvPicPr/>
                   </pic:nvPicPr>
                   <pic:blipFill>
-                    <a:blip r:embed="rId14"/>
+                    <a:blip r:embed="rId15"/>
                     <a:stretch>
                       <a:fillRect/>
                     </a:stretch>
@@ -12718,7 +12769,7 @@
     </w:p>
     <w:p>
       <w:pPr>
-        <w:pStyle w:val="Ttulo4"/>
+        <w:pStyle w:val="Heading4"/>
         <w:rPr>
           <w:rFonts w:ascii="Tahoma" w:hAnsi="Tahoma" w:cs="Tahoma"/>
         </w:rPr>
@@ -12768,7 +12819,7 @@
     </w:p>
     <w:p>
       <w:pPr>
-        <w:pStyle w:val="Ttulo3"/>
+        <w:pStyle w:val="Heading3"/>
         <w:rPr>
           <w:rFonts w:ascii="Tahoma" w:hAnsi="Tahoma" w:cs="Tahoma"/>
           <w:b/>
@@ -12884,7 +12935,7 @@
     </w:p>
     <w:p>
       <w:pPr>
-        <w:pStyle w:val="Ttulo3"/>
+        <w:pStyle w:val="Heading3"/>
         <w:rPr>
           <w:rFonts w:ascii="Tahoma" w:hAnsi="Tahoma" w:cs="Tahoma"/>
         </w:rPr>
@@ -12930,7 +12981,7 @@
                     <pic:cNvPicPr/>
                   </pic:nvPicPr>
                   <pic:blipFill>
-                    <a:blip r:embed="rId15"/>
+                    <a:blip r:embed="rId16"/>
                     <a:stretch>
                       <a:fillRect/>
                     </a:stretch>
@@ -12953,7 +13004,7 @@
     </w:p>
     <w:p>
       <w:pPr>
-        <w:pStyle w:val="Ttulo3"/>
+        <w:pStyle w:val="Heading3"/>
         <w:rPr>
           <w:rFonts w:ascii="Tahoma" w:hAnsi="Tahoma" w:cs="Tahoma"/>
         </w:rPr>
@@ -13006,7 +13057,7 @@
                     <pic:cNvPicPr/>
                   </pic:nvPicPr>
                   <pic:blipFill>
-                    <a:blip r:embed="rId16"/>
+                    <a:blip r:embed="rId17"/>
                     <a:stretch>
                       <a:fillRect/>
                     </a:stretch>
@@ -13048,7 +13099,7 @@
     </w:p>
     <w:p>
       <w:pPr>
-        <w:pStyle w:val="Ttulo2"/>
+        <w:pStyle w:val="Heading2"/>
         <w:rPr>
           <w:rFonts w:ascii="Tahoma" w:hAnsi="Tahoma" w:cs="Tahoma"/>
         </w:rPr>
@@ -13083,7 +13134,7 @@
     </w:p>
     <w:p>
       <w:pPr>
-        <w:pStyle w:val="Ttulo3"/>
+        <w:pStyle w:val="Heading3"/>
         <w:rPr>
           <w:rFonts w:ascii="Tahoma" w:hAnsi="Tahoma" w:cs="Tahoma"/>
         </w:rPr>
@@ -13130,7 +13181,7 @@
                     <pic:cNvPicPr/>
                   </pic:nvPicPr>
                   <pic:blipFill>
-                    <a:blip r:embed="rId17"/>
+                    <a:blip r:embed="rId18"/>
                     <a:stretch>
                       <a:fillRect/>
                     </a:stretch>
@@ -13227,7 +13278,7 @@
     </w:p>
     <w:p>
       <w:pPr>
-        <w:pStyle w:val="Ttulo2"/>
+        <w:pStyle w:val="Heading2"/>
         <w:rPr>
           <w:rFonts w:ascii="Tahoma" w:hAnsi="Tahoma" w:cs="Tahoma"/>
         </w:rPr>
@@ -13274,7 +13325,7 @@
     </w:p>
     <w:p>
       <w:pPr>
-        <w:pStyle w:val="Ttulo3"/>
+        <w:pStyle w:val="Heading3"/>
         <w:rPr>
           <w:rFonts w:ascii="Tahoma" w:hAnsi="Tahoma" w:cs="Tahoma"/>
           <w:b/>
@@ -13355,7 +13406,7 @@
                     <pic:cNvPicPr/>
                   </pic:nvPicPr>
                   <pic:blipFill>
-                    <a:blip r:embed="rId18"/>
+                    <a:blip r:embed="rId19"/>
                     <a:stretch>
                       <a:fillRect/>
                     </a:stretch>
@@ -13378,7 +13429,7 @@
     </w:p>
     <w:p>
       <w:pPr>
-        <w:pStyle w:val="Prrafodelista"/>
+        <w:pStyle w:val="ListParagraph"/>
         <w:spacing w:before="0" w:after="0"/>
         <w:ind w:left="714"/>
         <w:contextualSpacing w:val="0"/>
@@ -13390,7 +13441,7 @@
     </w:p>
     <w:tbl>
       <w:tblPr>
-        <w:tblStyle w:val="Tablaconcuadrcula"/>
+        <w:tblStyle w:val="TableGrid"/>
         <w:tblW w:w="7796" w:type="dxa"/>
         <w:tblInd w:w="817" w:type="dxa"/>
         <w:tblLook w:val="04A0" w:firstRow="1" w:lastRow="0" w:firstColumn="1" w:lastColumn="0" w:noHBand="0" w:noVBand="1"/>
@@ -13782,7 +13833,7 @@
     </w:p>
     <w:p>
       <w:pPr>
-        <w:pStyle w:val="Ttulo4"/>
+        <w:pStyle w:val="Heading4"/>
         <w:rPr>
           <w:rFonts w:ascii="Tahoma" w:hAnsi="Tahoma" w:cs="Tahoma"/>
         </w:rPr>
@@ -13852,7 +13903,7 @@
                     <pic:cNvPicPr/>
                   </pic:nvPicPr>
                   <pic:blipFill>
-                    <a:blip r:embed="rId19"/>
+                    <a:blip r:embed="rId20"/>
                     <a:stretch>
                       <a:fillRect/>
                     </a:stretch>
@@ -13875,7 +13926,7 @@
     </w:p>
     <w:p>
       <w:pPr>
-        <w:pStyle w:val="Ttulo4"/>
+        <w:pStyle w:val="Heading4"/>
         <w:rPr>
           <w:rFonts w:ascii="Tahoma" w:hAnsi="Tahoma" w:cs="Tahoma"/>
         </w:rPr>
@@ -13955,7 +14006,7 @@
                     <pic:cNvPicPr/>
                   </pic:nvPicPr>
                   <pic:blipFill>
-                    <a:blip r:embed="rId20"/>
+                    <a:blip r:embed="rId21"/>
                     <a:stretch>
                       <a:fillRect/>
                     </a:stretch>
@@ -13991,7 +14042,7 @@
     </w:p>
     <w:p>
       <w:pPr>
-        <w:pStyle w:val="Ttulo2"/>
+        <w:pStyle w:val="Heading2"/>
         <w:rPr>
           <w:rFonts w:ascii="Tahoma" w:hAnsi="Tahoma" w:cs="Tahoma"/>
         </w:rPr>
@@ -14061,7 +14112,7 @@
                     <pic:cNvPicPr/>
                   </pic:nvPicPr>
                   <pic:blipFill>
-                    <a:blip r:embed="rId21"/>
+                    <a:blip r:embed="rId22"/>
                     <a:stretch>
                       <a:fillRect/>
                     </a:stretch>
@@ -14103,7 +14154,7 @@
     </w:p>
     <w:p>
       <w:pPr>
-        <w:pStyle w:val="Ttulo2"/>
+        <w:pStyle w:val="Heading2"/>
         <w:rPr>
           <w:rFonts w:ascii="Tahoma" w:hAnsi="Tahoma" w:cs="Tahoma"/>
         </w:rPr>
@@ -14193,7 +14244,7 @@
     </w:p>
     <w:p>
       <w:pPr>
-        <w:pStyle w:val="Ttulo3"/>
+        <w:pStyle w:val="Heading3"/>
         <w:rPr>
           <w:rFonts w:ascii="Tahoma" w:hAnsi="Tahoma" w:cs="Tahoma"/>
         </w:rPr>
@@ -14236,7 +14287,7 @@
     </w:p>
     <w:p>
       <w:pPr>
-        <w:pStyle w:val="Ttulo3"/>
+        <w:pStyle w:val="Heading3"/>
         <w:rPr>
           <w:rFonts w:ascii="Tahoma" w:hAnsi="Tahoma" w:cs="Tahoma"/>
         </w:rPr>
@@ -14456,7 +14507,7 @@
     </w:p>
     <w:p>
       <w:pPr>
-        <w:pStyle w:val="Ttulo3"/>
+        <w:pStyle w:val="Heading3"/>
         <w:rPr>
           <w:rFonts w:ascii="Tahoma" w:hAnsi="Tahoma" w:cs="Tahoma"/>
         </w:rPr>
@@ -14497,7 +14548,7 @@
                     <pic:cNvPicPr/>
                   </pic:nvPicPr>
                   <pic:blipFill>
-                    <a:blip r:embed="rId22"/>
+                    <a:blip r:embed="rId23"/>
                     <a:stretch>
                       <a:fillRect/>
                     </a:stretch>
@@ -14540,7 +14591,7 @@
     </w:p>
     <w:p>
       <w:pPr>
-        <w:pStyle w:val="Ttulo2"/>
+        <w:pStyle w:val="Heading2"/>
         <w:rPr>
           <w:rFonts w:ascii="Tahoma" w:hAnsi="Tahoma" w:cs="Tahoma"/>
         </w:rPr>
@@ -14613,6 +14664,7 @@
       <w:r>
         <w:rPr>
           <w:rFonts w:ascii="Tahoma" w:hAnsi="Tahoma" w:cs="Tahoma"/>
+          <w:noProof/>
         </w:rPr>
         <w:drawing>
           <wp:inline distT="0" distB="0" distL="0" distR="0" wp14:anchorId="18D5EF06" wp14:editId="04720B61">
@@ -14630,7 +14682,7 @@
                     <pic:cNvPicPr/>
                   </pic:nvPicPr>
                   <pic:blipFill>
-                    <a:blip r:embed="rId23"/>
+                    <a:blip r:embed="rId24"/>
                     <a:stretch>
                       <a:fillRect/>
                     </a:stretch>
@@ -14653,6 +14705,7 @@
       <w:r>
         <w:rPr>
           <w:rFonts w:ascii="Tahoma" w:hAnsi="Tahoma" w:cs="Tahoma"/>
+          <w:noProof/>
         </w:rPr>
         <w:drawing>
           <wp:inline distT="0" distB="0" distL="0" distR="0" wp14:anchorId="54C19599" wp14:editId="219501C0">
@@ -14670,7 +14723,7 @@
                     <pic:cNvPicPr/>
                   </pic:nvPicPr>
                   <pic:blipFill>
-                    <a:blip r:embed="rId24"/>
+                    <a:blip r:embed="rId25"/>
                     <a:stretch>
                       <a:fillRect/>
                     </a:stretch>
@@ -14693,6 +14746,7 @@
       <w:r>
         <w:rPr>
           <w:rFonts w:ascii="Tahoma" w:hAnsi="Tahoma" w:cs="Tahoma"/>
+          <w:noProof/>
         </w:rPr>
         <w:drawing>
           <wp:inline distT="0" distB="0" distL="0" distR="0" wp14:anchorId="0F49882A" wp14:editId="2F32E922">
@@ -14710,7 +14764,7 @@
                     <pic:cNvPicPr/>
                   </pic:nvPicPr>
                   <pic:blipFill>
-                    <a:blip r:embed="rId25"/>
+                    <a:blip r:embed="rId26"/>
                     <a:stretch>
                       <a:fillRect/>
                     </a:stretch>
@@ -14739,6 +14793,7 @@
       <w:r>
         <w:rPr>
           <w:rFonts w:ascii="Tahoma" w:hAnsi="Tahoma" w:cs="Tahoma"/>
+          <w:noProof/>
         </w:rPr>
         <w:drawing>
           <wp:inline distT="0" distB="0" distL="0" distR="0" wp14:anchorId="67A80F1E" wp14:editId="7EB76ECD">
@@ -14756,7 +14811,7 @@
                     <pic:cNvPicPr/>
                   </pic:nvPicPr>
                   <pic:blipFill>
-                    <a:blip r:embed="rId26"/>
+                    <a:blip r:embed="rId27"/>
                     <a:stretch>
                       <a:fillRect/>
                     </a:stretch>
@@ -14829,6 +14884,7 @@
       <w:r>
         <w:rPr>
           <w:rFonts w:ascii="Tahoma" w:hAnsi="Tahoma" w:cs="Tahoma"/>
+          <w:noProof/>
         </w:rPr>
         <w:drawing>
           <wp:inline distT="0" distB="0" distL="0" distR="0" wp14:anchorId="6336D8C4" wp14:editId="522272FE">
@@ -14846,7 +14902,7 @@
                     <pic:cNvPicPr/>
                   </pic:nvPicPr>
                   <pic:blipFill>
-                    <a:blip r:embed="rId27"/>
+                    <a:blip r:embed="rId28"/>
                     <a:stretch>
                       <a:fillRect/>
                     </a:stretch>
@@ -14875,6 +14931,7 @@
       <w:r>
         <w:rPr>
           <w:rFonts w:ascii="Tahoma" w:hAnsi="Tahoma" w:cs="Tahoma"/>
+          <w:noProof/>
         </w:rPr>
         <w:drawing>
           <wp:inline distT="0" distB="0" distL="0" distR="0" wp14:anchorId="678F6C01" wp14:editId="33C0601C">
@@ -14892,7 +14949,7 @@
                     <pic:cNvPicPr/>
                   </pic:nvPicPr>
                   <pic:blipFill>
-                    <a:blip r:embed="rId28"/>
+                    <a:blip r:embed="rId29"/>
                     <a:stretch>
                       <a:fillRect/>
                     </a:stretch>
@@ -14959,6 +15016,7 @@
       <w:r>
         <w:rPr>
           <w:rFonts w:ascii="Tahoma" w:hAnsi="Tahoma" w:cs="Tahoma"/>
+          <w:noProof/>
         </w:rPr>
         <w:drawing>
           <wp:inline distT="0" distB="0" distL="0" distR="0" wp14:anchorId="06D8F9AC" wp14:editId="548D72EC">
@@ -14976,7 +15034,7 @@
                     <pic:cNvPicPr/>
                   </pic:nvPicPr>
                   <pic:blipFill>
-                    <a:blip r:embed="rId29"/>
+                    <a:blip r:embed="rId30"/>
                     <a:stretch>
                       <a:fillRect/>
                     </a:stretch>
@@ -15005,6 +15063,7 @@
       <w:r>
         <w:rPr>
           <w:rFonts w:ascii="Tahoma" w:hAnsi="Tahoma" w:cs="Tahoma"/>
+          <w:noProof/>
         </w:rPr>
         <w:drawing>
           <wp:inline distT="0" distB="0" distL="0" distR="0" wp14:anchorId="6D0A5DED" wp14:editId="432003CF">
@@ -15022,7 +15081,7 @@
                     <pic:cNvPicPr/>
                   </pic:nvPicPr>
                   <pic:blipFill>
-                    <a:blip r:embed="rId30"/>
+                    <a:blip r:embed="rId31"/>
                     <a:stretch>
                       <a:fillRect/>
                     </a:stretch>
@@ -15065,6 +15124,7 @@
       <w:r>
         <w:rPr>
           <w:rFonts w:ascii="Tahoma" w:hAnsi="Tahoma" w:cs="Tahoma"/>
+          <w:noProof/>
         </w:rPr>
         <w:drawing>
           <wp:inline distT="0" distB="0" distL="0" distR="0" wp14:anchorId="10B2EE5C" wp14:editId="4E14A6AD">
@@ -15082,7 +15142,7 @@
                     <pic:cNvPicPr/>
                   </pic:nvPicPr>
                   <pic:blipFill>
-                    <a:blip r:embed="rId31"/>
+                    <a:blip r:embed="rId32"/>
                     <a:stretch>
                       <a:fillRect/>
                     </a:stretch>
@@ -15111,6 +15171,7 @@
       <w:r>
         <w:rPr>
           <w:rFonts w:ascii="Tahoma" w:hAnsi="Tahoma" w:cs="Tahoma"/>
+          <w:noProof/>
         </w:rPr>
         <w:drawing>
           <wp:inline distT="0" distB="0" distL="0" distR="0" wp14:anchorId="27C81441" wp14:editId="560339AF">
@@ -15128,7 +15189,7 @@
                     <pic:cNvPicPr/>
                   </pic:nvPicPr>
                   <pic:blipFill>
-                    <a:blip r:embed="rId32"/>
+                    <a:blip r:embed="rId33"/>
                     <a:stretch>
                       <a:fillRect/>
                     </a:stretch>
@@ -15157,6 +15218,7 @@
       <w:r>
         <w:rPr>
           <w:rFonts w:ascii="Tahoma" w:hAnsi="Tahoma" w:cs="Tahoma"/>
+          <w:noProof/>
         </w:rPr>
         <w:drawing>
           <wp:inline distT="0" distB="0" distL="0" distR="0" wp14:anchorId="15044805" wp14:editId="246F58B1">
@@ -15174,7 +15236,7 @@
                     <pic:cNvPicPr/>
                   </pic:nvPicPr>
                   <pic:blipFill>
-                    <a:blip r:embed="rId33"/>
+                    <a:blip r:embed="rId34"/>
                     <a:stretch>
                       <a:fillRect/>
                     </a:stretch>
@@ -15218,6 +15280,7 @@
       <w:r>
         <w:rPr>
           <w:rFonts w:ascii="Tahoma" w:hAnsi="Tahoma" w:cs="Tahoma"/>
+          <w:noProof/>
         </w:rPr>
         <w:drawing>
           <wp:inline distT="0" distB="0" distL="0" distR="0" wp14:anchorId="3EC89C7C" wp14:editId="6EEFBD96">
@@ -15235,7 +15298,7 @@
                     <pic:cNvPicPr/>
                   </pic:nvPicPr>
                   <pic:blipFill>
-                    <a:blip r:embed="rId34"/>
+                    <a:blip r:embed="rId35"/>
                     <a:stretch>
                       <a:fillRect/>
                     </a:stretch>
@@ -15258,6 +15321,7 @@
       <w:r>
         <w:rPr>
           <w:rFonts w:ascii="Tahoma" w:hAnsi="Tahoma" w:cs="Tahoma"/>
+          <w:noProof/>
         </w:rPr>
         <w:drawing>
           <wp:inline distT="0" distB="0" distL="0" distR="0" wp14:anchorId="125CE84E" wp14:editId="4F75157D">
@@ -15275,7 +15339,7 @@
                     <pic:cNvPicPr/>
                   </pic:nvPicPr>
                   <pic:blipFill>
-                    <a:blip r:embed="rId35"/>
+                    <a:blip r:embed="rId36"/>
                     <a:stretch>
                       <a:fillRect/>
                     </a:stretch>
@@ -15298,6 +15362,7 @@
       <w:r>
         <w:rPr>
           <w:rFonts w:ascii="Tahoma" w:hAnsi="Tahoma" w:cs="Tahoma"/>
+          <w:noProof/>
         </w:rPr>
         <w:drawing>
           <wp:inline distT="0" distB="0" distL="0" distR="0" wp14:anchorId="439220A7" wp14:editId="4B18646E">
@@ -15315,7 +15380,7 @@
                     <pic:cNvPicPr/>
                   </pic:nvPicPr>
                   <pic:blipFill>
-                    <a:blip r:embed="rId36"/>
+                    <a:blip r:embed="rId37"/>
                     <a:stretch>
                       <a:fillRect/>
                     </a:stretch>
@@ -15345,6 +15410,7 @@
       <w:r>
         <w:rPr>
           <w:rFonts w:ascii="Tahoma" w:hAnsi="Tahoma" w:cs="Tahoma"/>
+          <w:noProof/>
         </w:rPr>
         <w:drawing>
           <wp:inline distT="0" distB="0" distL="0" distR="0" wp14:anchorId="4E3F8760" wp14:editId="07397517">
@@ -15362,7 +15428,7 @@
                     <pic:cNvPicPr/>
                   </pic:nvPicPr>
                   <pic:blipFill>
-                    <a:blip r:embed="rId37"/>
+                    <a:blip r:embed="rId38"/>
                     <a:stretch>
                       <a:fillRect/>
                     </a:stretch>
@@ -15385,6 +15451,7 @@
       <w:r>
         <w:rPr>
           <w:rFonts w:ascii="Tahoma" w:hAnsi="Tahoma" w:cs="Tahoma"/>
+          <w:noProof/>
         </w:rPr>
         <w:drawing>
           <wp:inline distT="0" distB="0" distL="0" distR="0" wp14:anchorId="5EF839D2" wp14:editId="02F9D6CA">
@@ -15402,7 +15469,7 @@
                     <pic:cNvPicPr/>
                   </pic:nvPicPr>
                   <pic:blipFill>
-                    <a:blip r:embed="rId38"/>
+                    <a:blip r:embed="rId39"/>
                     <a:stretch>
                       <a:fillRect/>
                     </a:stretch>
@@ -15445,6 +15512,7 @@
       <w:r>
         <w:rPr>
           <w:rFonts w:ascii="Tahoma" w:hAnsi="Tahoma" w:cs="Tahoma"/>
+          <w:noProof/>
         </w:rPr>
         <w:drawing>
           <wp:inline distT="0" distB="0" distL="0" distR="0" wp14:anchorId="662AFA3D" wp14:editId="4E86581E">
@@ -15462,7 +15530,7 @@
                     <pic:cNvPicPr/>
                   </pic:nvPicPr>
                   <pic:blipFill>
-                    <a:blip r:embed="rId39"/>
+                    <a:blip r:embed="rId40"/>
                     <a:stretch>
                       <a:fillRect/>
                     </a:stretch>
@@ -15485,6 +15553,7 @@
       <w:r>
         <w:rPr>
           <w:rFonts w:ascii="Tahoma" w:hAnsi="Tahoma" w:cs="Tahoma"/>
+          <w:noProof/>
         </w:rPr>
         <w:drawing>
           <wp:inline distT="0" distB="0" distL="0" distR="0" wp14:anchorId="5246D1A1" wp14:editId="224AB0F8">
@@ -15502,7 +15571,7 @@
                     <pic:cNvPicPr/>
                   </pic:nvPicPr>
                   <pic:blipFill>
-                    <a:blip r:embed="rId40"/>
+                    <a:blip r:embed="rId41"/>
                     <a:stretch>
                       <a:fillRect/>
                     </a:stretch>
@@ -15525,6 +15594,7 @@
       <w:r>
         <w:rPr>
           <w:rFonts w:ascii="Tahoma" w:hAnsi="Tahoma" w:cs="Tahoma"/>
+          <w:noProof/>
         </w:rPr>
         <w:drawing>
           <wp:inline distT="0" distB="0" distL="0" distR="0" wp14:anchorId="7352D806" wp14:editId="5F742F22">
@@ -15542,7 +15612,7 @@
                     <pic:cNvPicPr/>
                   </pic:nvPicPr>
                   <pic:blipFill>
-                    <a:blip r:embed="rId41"/>
+                    <a:blip r:embed="rId42"/>
                     <a:stretch>
                       <a:fillRect/>
                     </a:stretch>
@@ -15585,6 +15655,7 @@
       <w:r>
         <w:rPr>
           <w:rFonts w:ascii="Tahoma" w:hAnsi="Tahoma" w:cs="Tahoma"/>
+          <w:noProof/>
         </w:rPr>
         <w:drawing>
           <wp:inline distT="0" distB="0" distL="0" distR="0" wp14:anchorId="06866389" wp14:editId="21D97F69">
@@ -15602,7 +15673,7 @@
                     <pic:cNvPicPr/>
                   </pic:nvPicPr>
                   <pic:blipFill>
-                    <a:blip r:embed="rId42"/>
+                    <a:blip r:embed="rId43"/>
                     <a:stretch>
                       <a:fillRect/>
                     </a:stretch>
@@ -15625,6 +15696,7 @@
       <w:r>
         <w:rPr>
           <w:rFonts w:ascii="Tahoma" w:hAnsi="Tahoma" w:cs="Tahoma"/>
+          <w:noProof/>
         </w:rPr>
         <w:drawing>
           <wp:inline distT="0" distB="0" distL="0" distR="0" wp14:anchorId="430D5D8D" wp14:editId="5E4CF224">
@@ -15642,7 +15714,7 @@
                     <pic:cNvPicPr/>
                   </pic:nvPicPr>
                   <pic:blipFill>
-                    <a:blip r:embed="rId43"/>
+                    <a:blip r:embed="rId44"/>
                     <a:stretch>
                       <a:fillRect/>
                     </a:stretch>
@@ -15715,7 +15787,7 @@
                     <pic:cNvPicPr/>
                   </pic:nvPicPr>
                   <pic:blipFill>
-                    <a:blip r:embed="rId44"/>
+                    <a:blip r:embed="rId45"/>
                     <a:stretch>
                       <a:fillRect/>
                     </a:stretch>
@@ -15757,7 +15829,7 @@
     </w:p>
     <w:p>
       <w:pPr>
-        <w:pStyle w:val="Ttulo1"/>
+        <w:pStyle w:val="Heading1"/>
         <w:pBdr>
           <w:bottom w:val="single" w:sz="4" w:space="1" w:color="auto"/>
           <w:right w:val="single" w:sz="4" w:space="4" w:color="auto"/>
@@ -15799,7 +15871,7 @@
     </w:p>
     <w:p>
       <w:pPr>
-        <w:pStyle w:val="Ttulo2"/>
+        <w:pStyle w:val="Heading2"/>
         <w:rPr>
           <w:rFonts w:ascii="Tahoma" w:hAnsi="Tahoma" w:cs="Tahoma"/>
         </w:rPr>
@@ -15917,7 +15989,7 @@
     </w:p>
     <w:p>
       <w:pPr>
-        <w:pStyle w:val="Ttulo2"/>
+        <w:pStyle w:val="Heading2"/>
         <w:rPr>
           <w:rFonts w:ascii="Tahoma" w:hAnsi="Tahoma" w:cs="Tahoma"/>
         </w:rPr>
@@ -16503,7 +16575,7 @@
     </w:p>
     <w:p>
       <w:pPr>
-        <w:pStyle w:val="Ttulo2"/>
+        <w:pStyle w:val="Heading2"/>
         <w:rPr>
           <w:rFonts w:ascii="Tahoma" w:hAnsi="Tahoma" w:cs="Tahoma"/>
         </w:rPr>
@@ -16561,7 +16633,7 @@
     </w:p>
     <w:p>
       <w:pPr>
-        <w:pStyle w:val="Ttulo3"/>
+        <w:pStyle w:val="Heading3"/>
         <w:rPr>
           <w:rFonts w:ascii="Tahoma" w:hAnsi="Tahoma" w:cs="Tahoma"/>
           <w:b/>
@@ -16603,7 +16675,7 @@
     </w:p>
     <w:p>
       <w:pPr>
-        <w:pStyle w:val="Ttulo3"/>
+        <w:pStyle w:val="Heading3"/>
         <w:rPr>
           <w:rFonts w:ascii="Tahoma" w:hAnsi="Tahoma" w:cs="Tahoma"/>
           <w:b/>
@@ -16639,7 +16711,7 @@
     </w:p>
     <w:p>
       <w:pPr>
-        <w:pStyle w:val="Ttulo3"/>
+        <w:pStyle w:val="Heading3"/>
         <w:rPr>
           <w:rFonts w:ascii="Tahoma" w:hAnsi="Tahoma" w:cs="Tahoma"/>
           <w:b/>
@@ -16676,7 +16748,7 @@
     <w:p/>
     <w:p>
       <w:pPr>
-        <w:pStyle w:val="Ttulo3"/>
+        <w:pStyle w:val="Heading3"/>
         <w:rPr>
           <w:rFonts w:ascii="Tahoma" w:hAnsi="Tahoma" w:cs="Tahoma"/>
           <w:b/>
@@ -16713,7 +16785,7 @@
     </w:p>
     <w:p>
       <w:pPr>
-        <w:pStyle w:val="Ttulo3"/>
+        <w:pStyle w:val="Heading3"/>
         <w:rPr>
           <w:rFonts w:ascii="Tahoma" w:hAnsi="Tahoma" w:cs="Tahoma"/>
           <w:b/>
@@ -16800,7 +16872,7 @@
     </w:p>
     <w:p>
       <w:pPr>
-        <w:pStyle w:val="Ttulo2"/>
+        <w:pStyle w:val="Heading2"/>
         <w:rPr>
           <w:rFonts w:ascii="Tahoma" w:hAnsi="Tahoma" w:cs="Tahoma"/>
         </w:rPr>
@@ -16829,7 +16901,7 @@
     </w:p>
     <w:p>
       <w:pPr>
-        <w:pStyle w:val="Ttulo3"/>
+        <w:pStyle w:val="Heading3"/>
         <w:rPr>
           <w:rFonts w:ascii="Tahoma" w:hAnsi="Tahoma" w:cs="Tahoma"/>
         </w:rPr>
@@ -16862,7 +16934,7 @@
     </w:p>
     <w:p>
       <w:pPr>
-        <w:pStyle w:val="Ttulo4"/>
+        <w:pStyle w:val="Heading4"/>
         <w:rPr>
           <w:rFonts w:ascii="Tahoma" w:hAnsi="Tahoma" w:cs="Tahoma"/>
         </w:rPr>
@@ -16900,7 +16972,7 @@
     </w:p>
     <w:p>
       <w:pPr>
-        <w:pStyle w:val="Ttulo4"/>
+        <w:pStyle w:val="Heading4"/>
         <w:rPr>
           <w:rFonts w:ascii="Tahoma" w:hAnsi="Tahoma" w:cs="Tahoma"/>
         </w:rPr>
@@ -16938,7 +17010,7 @@
     </w:p>
     <w:p>
       <w:pPr>
-        <w:pStyle w:val="Ttulo4"/>
+        <w:pStyle w:val="Heading4"/>
         <w:rPr>
           <w:rFonts w:ascii="Tahoma" w:hAnsi="Tahoma" w:cs="Tahoma"/>
         </w:rPr>
@@ -16997,7 +17069,7 @@
     </w:p>
     <w:p>
       <w:pPr>
-        <w:pStyle w:val="Ttulo1"/>
+        <w:pStyle w:val="Heading1"/>
         <w:pBdr>
           <w:bottom w:val="single" w:sz="4" w:space="1" w:color="auto"/>
           <w:right w:val="single" w:sz="4" w:space="4" w:color="auto"/>
@@ -17039,7 +17111,7 @@
     </w:p>
     <w:p>
       <w:pPr>
-        <w:pStyle w:val="Ttulo2"/>
+        <w:pStyle w:val="Heading2"/>
         <w:rPr>
           <w:rFonts w:ascii="Tahoma" w:hAnsi="Tahoma" w:cs="Tahoma"/>
         </w:rPr>
@@ -17727,7 +17799,7 @@
     </w:p>
     <w:p>
       <w:pPr>
-        <w:pStyle w:val="Ttulo2"/>
+        <w:pStyle w:val="Heading2"/>
         <w:rPr>
           <w:rFonts w:ascii="Tahoma" w:hAnsi="Tahoma" w:cs="Tahoma"/>
         </w:rPr>
@@ -17788,7 +17860,7 @@
     </w:p>
     <w:p>
       <w:pPr>
-        <w:pStyle w:val="Prrafodelista"/>
+        <w:pStyle w:val="ListParagraph"/>
         <w:numPr>
           <w:ilvl w:val="0"/>
           <w:numId w:val="5"/>
@@ -17807,7 +17879,7 @@
     </w:p>
     <w:p>
       <w:pPr>
-        <w:pStyle w:val="Prrafodelista"/>
+        <w:pStyle w:val="ListParagraph"/>
         <w:numPr>
           <w:ilvl w:val="0"/>
           <w:numId w:val="5"/>
@@ -17826,7 +17898,7 @@
     </w:p>
     <w:p>
       <w:pPr>
-        <w:pStyle w:val="Prrafodelista"/>
+        <w:pStyle w:val="ListParagraph"/>
         <w:numPr>
           <w:ilvl w:val="0"/>
           <w:numId w:val="5"/>
@@ -17845,7 +17917,7 @@
     </w:p>
     <w:p>
       <w:pPr>
-        <w:pStyle w:val="Prrafodelista"/>
+        <w:pStyle w:val="ListParagraph"/>
         <w:numPr>
           <w:ilvl w:val="0"/>
           <w:numId w:val="5"/>
@@ -17878,7 +17950,7 @@
     </w:p>
     <w:p>
       <w:pPr>
-        <w:pStyle w:val="Prrafodelista"/>
+        <w:pStyle w:val="ListParagraph"/>
         <w:numPr>
           <w:ilvl w:val="0"/>
           <w:numId w:val="5"/>
@@ -17897,7 +17969,7 @@
     </w:p>
     <w:p>
       <w:pPr>
-        <w:pStyle w:val="Prrafodelista"/>
+        <w:pStyle w:val="ListParagraph"/>
         <w:numPr>
           <w:ilvl w:val="0"/>
           <w:numId w:val="5"/>
@@ -17916,7 +17988,7 @@
     </w:p>
     <w:p>
       <w:pPr>
-        <w:pStyle w:val="Prrafodelista"/>
+        <w:pStyle w:val="ListParagraph"/>
         <w:numPr>
           <w:ilvl w:val="0"/>
           <w:numId w:val="5"/>
@@ -17949,7 +18021,7 @@
     </w:p>
     <w:p>
       <w:pPr>
-        <w:pStyle w:val="Prrafodelista"/>
+        <w:pStyle w:val="ListParagraph"/>
         <w:numPr>
           <w:ilvl w:val="0"/>
           <w:numId w:val="5"/>
@@ -17968,7 +18040,7 @@
     </w:p>
     <w:p>
       <w:pPr>
-        <w:pStyle w:val="Prrafodelista"/>
+        <w:pStyle w:val="ListParagraph"/>
         <w:numPr>
           <w:ilvl w:val="0"/>
           <w:numId w:val="5"/>
@@ -18001,7 +18073,7 @@
     </w:p>
     <w:p>
       <w:pPr>
-        <w:pStyle w:val="Prrafodelista"/>
+        <w:pStyle w:val="ListParagraph"/>
         <w:numPr>
           <w:ilvl w:val="0"/>
           <w:numId w:val="5"/>
@@ -18020,7 +18092,7 @@
     </w:p>
     <w:p>
       <w:pPr>
-        <w:pStyle w:val="Prrafodelista"/>
+        <w:pStyle w:val="ListParagraph"/>
         <w:numPr>
           <w:ilvl w:val="0"/>
           <w:numId w:val="5"/>
@@ -18039,7 +18111,7 @@
     </w:p>
     <w:p>
       <w:pPr>
-        <w:pStyle w:val="Prrafodelista"/>
+        <w:pStyle w:val="ListParagraph"/>
         <w:numPr>
           <w:ilvl w:val="0"/>
           <w:numId w:val="5"/>
@@ -18084,7 +18156,7 @@
     </w:p>
     <w:p>
       <w:pPr>
-        <w:pStyle w:val="Prrafodelista"/>
+        <w:pStyle w:val="ListParagraph"/>
         <w:numPr>
           <w:ilvl w:val="0"/>
           <w:numId w:val="5"/>
@@ -18103,7 +18175,7 @@
     </w:p>
     <w:p>
       <w:pPr>
-        <w:pStyle w:val="Prrafodelista"/>
+        <w:pStyle w:val="ListParagraph"/>
         <w:numPr>
           <w:ilvl w:val="0"/>
           <w:numId w:val="5"/>
@@ -18122,7 +18194,7 @@
     </w:p>
     <w:p>
       <w:pPr>
-        <w:pStyle w:val="Prrafodelista"/>
+        <w:pStyle w:val="ListParagraph"/>
         <w:numPr>
           <w:ilvl w:val="0"/>
           <w:numId w:val="5"/>
@@ -18155,7 +18227,7 @@
     </w:p>
     <w:p>
       <w:pPr>
-        <w:pStyle w:val="Prrafodelista"/>
+        <w:pStyle w:val="ListParagraph"/>
         <w:numPr>
           <w:ilvl w:val="0"/>
           <w:numId w:val="5"/>
@@ -18174,7 +18246,7 @@
     </w:p>
     <w:p>
       <w:pPr>
-        <w:pStyle w:val="Prrafodelista"/>
+        <w:pStyle w:val="ListParagraph"/>
         <w:numPr>
           <w:ilvl w:val="0"/>
           <w:numId w:val="5"/>
@@ -18193,7 +18265,7 @@
     </w:p>
     <w:p>
       <w:pPr>
-        <w:pStyle w:val="Prrafodelista"/>
+        <w:pStyle w:val="ListParagraph"/>
         <w:numPr>
           <w:ilvl w:val="0"/>
           <w:numId w:val="5"/>
@@ -18277,7 +18349,7 @@
     </w:p>
     <w:p>
       <w:pPr>
-        <w:pStyle w:val="Prrafodelista"/>
+        <w:pStyle w:val="ListParagraph"/>
         <w:numPr>
           <w:ilvl w:val="0"/>
           <w:numId w:val="6"/>
@@ -18296,7 +18368,7 @@
     </w:p>
     <w:p>
       <w:pPr>
-        <w:pStyle w:val="Prrafodelista"/>
+        <w:pStyle w:val="ListParagraph"/>
         <w:numPr>
           <w:ilvl w:val="0"/>
           <w:numId w:val="6"/>
@@ -18315,7 +18387,7 @@
     </w:p>
     <w:p>
       <w:pPr>
-        <w:pStyle w:val="Prrafodelista"/>
+        <w:pStyle w:val="ListParagraph"/>
         <w:numPr>
           <w:ilvl w:val="0"/>
           <w:numId w:val="6"/>
@@ -18334,7 +18406,7 @@
     </w:p>
     <w:p>
       <w:pPr>
-        <w:pStyle w:val="Prrafodelista"/>
+        <w:pStyle w:val="ListParagraph"/>
         <w:numPr>
           <w:ilvl w:val="0"/>
           <w:numId w:val="6"/>
@@ -18367,7 +18439,7 @@
     </w:p>
     <w:p>
       <w:pPr>
-        <w:pStyle w:val="Prrafodelista"/>
+        <w:pStyle w:val="ListParagraph"/>
         <w:numPr>
           <w:ilvl w:val="0"/>
           <w:numId w:val="6"/>
@@ -18386,7 +18458,7 @@
     </w:p>
     <w:p>
       <w:pPr>
-        <w:pStyle w:val="Prrafodelista"/>
+        <w:pStyle w:val="ListParagraph"/>
         <w:numPr>
           <w:ilvl w:val="0"/>
           <w:numId w:val="6"/>
@@ -18405,7 +18477,7 @@
     </w:p>
     <w:p>
       <w:pPr>
-        <w:pStyle w:val="Prrafodelista"/>
+        <w:pStyle w:val="ListParagraph"/>
         <w:numPr>
           <w:ilvl w:val="0"/>
           <w:numId w:val="6"/>
@@ -18438,7 +18510,7 @@
     </w:p>
     <w:p>
       <w:pPr>
-        <w:pStyle w:val="Prrafodelista"/>
+        <w:pStyle w:val="ListParagraph"/>
         <w:numPr>
           <w:ilvl w:val="0"/>
           <w:numId w:val="6"/>
@@ -18457,7 +18529,7 @@
     </w:p>
     <w:p>
       <w:pPr>
-        <w:pStyle w:val="Prrafodelista"/>
+        <w:pStyle w:val="ListParagraph"/>
         <w:numPr>
           <w:ilvl w:val="0"/>
           <w:numId w:val="6"/>
@@ -18476,7 +18548,7 @@
     </w:p>
     <w:p>
       <w:pPr>
-        <w:pStyle w:val="Prrafodelista"/>
+        <w:pStyle w:val="ListParagraph"/>
         <w:numPr>
           <w:ilvl w:val="0"/>
           <w:numId w:val="6"/>
@@ -18495,7 +18567,7 @@
     </w:p>
     <w:p>
       <w:pPr>
-        <w:pStyle w:val="Prrafodelista"/>
+        <w:pStyle w:val="ListParagraph"/>
         <w:numPr>
           <w:ilvl w:val="0"/>
           <w:numId w:val="6"/>
@@ -18528,7 +18600,7 @@
     </w:p>
     <w:p>
       <w:pPr>
-        <w:pStyle w:val="Prrafodelista"/>
+        <w:pStyle w:val="ListParagraph"/>
         <w:numPr>
           <w:ilvl w:val="0"/>
           <w:numId w:val="6"/>
@@ -18547,7 +18619,7 @@
     </w:p>
     <w:p>
       <w:pPr>
-        <w:pStyle w:val="Prrafodelista"/>
+        <w:pStyle w:val="ListParagraph"/>
         <w:numPr>
           <w:ilvl w:val="0"/>
           <w:numId w:val="6"/>
@@ -18566,7 +18638,7 @@
     </w:p>
     <w:p>
       <w:pPr>
-        <w:pStyle w:val="Prrafodelista"/>
+        <w:pStyle w:val="ListParagraph"/>
         <w:numPr>
           <w:ilvl w:val="0"/>
           <w:numId w:val="6"/>
@@ -18599,7 +18671,7 @@
     </w:p>
     <w:p>
       <w:pPr>
-        <w:pStyle w:val="Prrafodelista"/>
+        <w:pStyle w:val="ListParagraph"/>
         <w:numPr>
           <w:ilvl w:val="0"/>
           <w:numId w:val="6"/>
@@ -18618,7 +18690,7 @@
     </w:p>
     <w:p>
       <w:pPr>
-        <w:pStyle w:val="Prrafodelista"/>
+        <w:pStyle w:val="ListParagraph"/>
         <w:numPr>
           <w:ilvl w:val="0"/>
           <w:numId w:val="6"/>
@@ -18637,7 +18709,7 @@
     </w:p>
     <w:p>
       <w:pPr>
-        <w:pStyle w:val="Prrafodelista"/>
+        <w:pStyle w:val="ListParagraph"/>
         <w:numPr>
           <w:ilvl w:val="0"/>
           <w:numId w:val="6"/>
@@ -18656,7 +18728,7 @@
     </w:p>
     <w:p>
       <w:pPr>
-        <w:pStyle w:val="Prrafodelista"/>
+        <w:pStyle w:val="ListParagraph"/>
         <w:numPr>
           <w:ilvl w:val="0"/>
           <w:numId w:val="6"/>
@@ -18689,7 +18761,7 @@
     </w:p>
     <w:p>
       <w:pPr>
-        <w:pStyle w:val="Prrafodelista"/>
+        <w:pStyle w:val="ListParagraph"/>
         <w:numPr>
           <w:ilvl w:val="0"/>
           <w:numId w:val="6"/>
@@ -18708,7 +18780,7 @@
     </w:p>
     <w:p>
       <w:pPr>
-        <w:pStyle w:val="Prrafodelista"/>
+        <w:pStyle w:val="ListParagraph"/>
         <w:numPr>
           <w:ilvl w:val="0"/>
           <w:numId w:val="6"/>
@@ -18727,7 +18799,7 @@
     </w:p>
     <w:p>
       <w:pPr>
-        <w:pStyle w:val="Prrafodelista"/>
+        <w:pStyle w:val="ListParagraph"/>
         <w:numPr>
           <w:ilvl w:val="0"/>
           <w:numId w:val="6"/>
@@ -18820,7 +18892,7 @@
     </w:p>
     <w:p>
       <w:pPr>
-        <w:pStyle w:val="Prrafodelista"/>
+        <w:pStyle w:val="ListParagraph"/>
         <w:numPr>
           <w:ilvl w:val="0"/>
           <w:numId w:val="8"/>
@@ -18839,7 +18911,7 @@
     </w:p>
     <w:p>
       <w:pPr>
-        <w:pStyle w:val="Prrafodelista"/>
+        <w:pStyle w:val="ListParagraph"/>
         <w:numPr>
           <w:ilvl w:val="0"/>
           <w:numId w:val="8"/>
@@ -18858,7 +18930,7 @@
     </w:p>
     <w:p>
       <w:pPr>
-        <w:pStyle w:val="Prrafodelista"/>
+        <w:pStyle w:val="ListParagraph"/>
         <w:numPr>
           <w:ilvl w:val="0"/>
           <w:numId w:val="8"/>
@@ -18893,7 +18965,7 @@
     </w:p>
     <w:p>
       <w:pPr>
-        <w:pStyle w:val="Prrafodelista"/>
+        <w:pStyle w:val="ListParagraph"/>
         <w:numPr>
           <w:ilvl w:val="0"/>
           <w:numId w:val="7"/>
@@ -18912,7 +18984,7 @@
     </w:p>
     <w:p>
       <w:pPr>
-        <w:pStyle w:val="Prrafodelista"/>
+        <w:pStyle w:val="ListParagraph"/>
         <w:numPr>
           <w:ilvl w:val="0"/>
           <w:numId w:val="7"/>
@@ -18945,7 +19017,7 @@
     </w:p>
     <w:p>
       <w:pPr>
-        <w:pStyle w:val="Prrafodelista"/>
+        <w:pStyle w:val="ListParagraph"/>
         <w:numPr>
           <w:ilvl w:val="0"/>
           <w:numId w:val="7"/>
@@ -18964,7 +19036,7 @@
     </w:p>
     <w:p>
       <w:pPr>
-        <w:pStyle w:val="Prrafodelista"/>
+        <w:pStyle w:val="ListParagraph"/>
         <w:numPr>
           <w:ilvl w:val="0"/>
           <w:numId w:val="7"/>
@@ -19002,7 +19074,7 @@
     </w:p>
     <w:p>
       <w:pPr>
-        <w:pStyle w:val="Ttulo1"/>
+        <w:pStyle w:val="Heading1"/>
         <w:pBdr>
           <w:bottom w:val="single" w:sz="4" w:space="1" w:color="auto"/>
           <w:right w:val="single" w:sz="4" w:space="4" w:color="auto"/>
@@ -19044,7 +19116,7 @@
     </w:p>
     <w:p>
       <w:pPr>
-        <w:pStyle w:val="Ttulo2"/>
+        <w:pStyle w:val="Heading2"/>
         <w:rPr>
           <w:rFonts w:ascii="Tahoma" w:hAnsi="Tahoma" w:cs="Tahoma"/>
         </w:rPr>
@@ -19104,7 +19176,7 @@
     </w:p>
     <w:p>
       <w:pPr>
-        <w:pStyle w:val="Ttulo2"/>
+        <w:pStyle w:val="Heading2"/>
         <w:rPr>
           <w:rFonts w:ascii="Tahoma" w:hAnsi="Tahoma" w:cs="Tahoma"/>
         </w:rPr>
@@ -19814,7 +19886,7 @@
     </w:p>
     <w:p>
       <w:pPr>
-        <w:pStyle w:val="Ttulo1"/>
+        <w:pStyle w:val="Heading1"/>
         <w:pBdr>
           <w:bottom w:val="single" w:sz="4" w:space="1" w:color="auto"/>
           <w:right w:val="single" w:sz="4" w:space="4" w:color="auto"/>
@@ -19840,7 +19912,7 @@
     </w:p>
     <w:p>
       <w:pPr>
-        <w:pStyle w:val="Ttulo2"/>
+        <w:pStyle w:val="Heading2"/>
         <w:rPr>
           <w:rFonts w:ascii="Tahoma" w:hAnsi="Tahoma" w:cs="Tahoma"/>
         </w:rPr>
@@ -19917,7 +19989,7 @@
     </w:p>
     <w:p>
       <w:pPr>
-        <w:pStyle w:val="Prrafodelista"/>
+        <w:pStyle w:val="ListParagraph"/>
         <w:numPr>
           <w:ilvl w:val="0"/>
           <w:numId w:val="2"/>
@@ -19943,7 +20015,7 @@
     </w:p>
     <w:p>
       <w:pPr>
-        <w:pStyle w:val="Prrafodelista"/>
+        <w:pStyle w:val="ListParagraph"/>
         <w:numPr>
           <w:ilvl w:val="0"/>
           <w:numId w:val="2"/>
@@ -19969,7 +20041,7 @@
     </w:p>
     <w:p>
       <w:pPr>
-        <w:pStyle w:val="Prrafodelista"/>
+        <w:pStyle w:val="ListParagraph"/>
         <w:numPr>
           <w:ilvl w:val="0"/>
           <w:numId w:val="2"/>
@@ -19995,7 +20067,7 @@
     </w:p>
     <w:p>
       <w:pPr>
-        <w:pStyle w:val="Prrafodelista"/>
+        <w:pStyle w:val="ListParagraph"/>
         <w:ind w:left="360"/>
         <w:rPr>
           <w:rFonts w:ascii="Tahoma" w:hAnsi="Tahoma" w:cs="Tahoma"/>
@@ -20030,10 +20102,10 @@
       </w:r>
     </w:p>
     <w:sectPr>
-      <w:headerReference w:type="even" r:id="rId45"/>
-      <w:headerReference w:type="default" r:id="rId46"/>
-      <w:footerReference w:type="even" r:id="rId47"/>
-      <w:footerReference w:type="default" r:id="rId48"/>
+      <w:headerReference w:type="even" r:id="rId46"/>
+      <w:headerReference w:type="default" r:id="rId47"/>
+      <w:footerReference w:type="even" r:id="rId48"/>
+      <w:footerReference w:type="default" r:id="rId49"/>
       <w:pgSz w:w="11906" w:h="16838" w:code="9"/>
       <w:pgMar w:top="1418" w:right="1701" w:bottom="1418" w:left="1701" w:header="567" w:footer="567" w:gutter="0"/>
       <w:cols w:space="708"/>
@@ -20097,7 +20169,7 @@
         </w:tcPr>
         <w:p>
           <w:pPr>
-            <w:pStyle w:val="Piedepgina"/>
+            <w:pStyle w:val="Footer"/>
             <w:jc w:val="right"/>
             <w:rPr>
               <w:rFonts w:ascii="Tahoma" w:hAnsi="Tahoma" w:cs="Tahoma"/>
@@ -20150,7 +20222,7 @@
         </w:tcPr>
         <w:p>
           <w:pPr>
-            <w:pStyle w:val="Piedepgina"/>
+            <w:pStyle w:val="Footer"/>
             <w:spacing w:line="480" w:lineRule="auto"/>
             <w:rPr>
               <w:u w:val="single"/>
@@ -20165,7 +20237,7 @@
   </w:tbl>
   <w:p>
     <w:pPr>
-      <w:pStyle w:val="Piedepgina"/>
+      <w:pStyle w:val="Footer"/>
     </w:pPr>
   </w:p>
 </w:ftr>
@@ -20198,7 +20270,7 @@
         </w:tcPr>
         <w:p>
           <w:pPr>
-            <w:pStyle w:val="Piedepgina"/>
+            <w:pStyle w:val="Footer"/>
             <w:jc w:val="right"/>
           </w:pPr>
           <w:r>
@@ -20216,7 +20288,7 @@
         </w:tcPr>
         <w:p>
           <w:pPr>
-            <w:pStyle w:val="Encabezado"/>
+            <w:pStyle w:val="Header"/>
             <w:rPr>
               <w:color w:val="FFFFFF" w:themeColor="background1"/>
             </w:rPr>
@@ -20250,7 +20322,7 @@
   </w:tbl>
   <w:p>
     <w:pPr>
-      <w:pStyle w:val="Piedepgina"/>
+      <w:pStyle w:val="Footer"/>
     </w:pPr>
   </w:p>
 </w:ftr>
@@ -20285,7 +20357,7 @@
 <w:hdr xmlns:wpc="http://schemas.microsoft.com/office/word/2010/wordprocessingCanvas" xmlns:cx="http://schemas.microsoft.com/office/drawing/2014/chartex" xmlns:cx1="http://schemas.microsoft.com/office/drawing/2015/9/8/chartex" xmlns:cx2="http://schemas.microsoft.com/office/drawing/2015/10/21/chartex" xmlns:cx3="http://schemas.microsoft.com/office/drawing/2016/5/9/chartex" xmlns:cx4="http://schemas.microsoft.com/office/drawing/2016/5/10/chartex" xmlns:cx5="http://schemas.microsoft.com/office/drawing/2016/5/11/chartex" xmlns:cx6="http://schemas.microsoft.com/office/drawing/2016/5/12/chartex" xmlns:cx7="http://schemas.microsoft.com/office/drawing/2016/5/13/chartex" xmlns:cx8="http://schemas.microsoft.com/office/drawing/2016/5/14/chartex" xmlns:mc="http://schemas.openxmlformats.org/markup-compatibility/2006" xmlns:aink="http://schemas.microsoft.com/office/drawing/2016/ink" xmlns:am3d="http://schemas.microsoft.com/office/drawing/2017/model3d" xmlns:o="urn:schemas-microsoft-com:office:office" xmlns:oel="http://schemas.microsoft.com/office/2019/extlst" xmlns:r="http://schemas.openxmlformats.org/officeDocument/2006/relationships" xmlns:m="http://schemas.openxmlformats.org/officeDocument/2006/math" xmlns:v="urn:schemas-microsoft-com:vml" xmlns:wp14="http://schemas.microsoft.com/office/word/2010/wordprocessingDrawing" xmlns:wp="http://schemas.openxmlformats.org/drawingml/2006/wordprocessingDrawing" xmlns:w10="urn:schemas-microsoft-com:office:word" xmlns:w="http://schemas.openxmlformats.org/wordprocessingml/2006/main" xmlns:w14="http://schemas.microsoft.com/office/word/2010/wordml" xmlns:w15="http://schemas.microsoft.com/office/word/2012/wordml" xmlns:w16cex="http://schemas.microsoft.com/office/word/2018/wordml/cex" xmlns:w16cid="http://schemas.microsoft.com/office/word/2016/wordml/cid" xmlns:w16="http://schemas.microsoft.com/office/word/2018/wordml" xmlns:w16du="http://schemas.microsoft.com/office/word/2023/wordml/word16du" xmlns:w16sdtdh="http://schemas.microsoft.com/office/word/2020/wordml/sdtdatahash" xmlns:w16sdtfl="http://schemas.microsoft.com/office/word/2024/wordml/sdtformatlock" xmlns:w16se="http://schemas.microsoft.com/office/word/2015/wordml/symex" xmlns:wpg="http://schemas.microsoft.com/office/word/2010/wordprocessingGroup" xmlns:wpi="http://schemas.microsoft.com/office/word/2010/wordprocessingInk" xmlns:wne="http://schemas.microsoft.com/office/word/2006/wordml" xmlns:wps="http://schemas.microsoft.com/office/word/2010/wordprocessingShape" mc:Ignorable="w14 w15 w16se w16cid w16 w16cex w16sdtdh w16sdtfl w16du wp14">
   <w:p>
     <w:pPr>
-      <w:pStyle w:val="Encabezado"/>
+      <w:pStyle w:val="Header"/>
       <w:pBdr>
         <w:bottom w:val="thickThinSmallGap" w:sz="24" w:space="1" w:color="585858" w:themeColor="accent2" w:themeShade="7F"/>
       </w:pBdr>
@@ -20341,7 +20413,7 @@
 <w:hdr xmlns:wpc="http://schemas.microsoft.com/office/word/2010/wordprocessingCanvas" xmlns:cx="http://schemas.microsoft.com/office/drawing/2014/chartex" xmlns:cx1="http://schemas.microsoft.com/office/drawing/2015/9/8/chartex" xmlns:cx2="http://schemas.microsoft.com/office/drawing/2015/10/21/chartex" xmlns:cx3="http://schemas.microsoft.com/office/drawing/2016/5/9/chartex" xmlns:cx4="http://schemas.microsoft.com/office/drawing/2016/5/10/chartex" xmlns:cx5="http://schemas.microsoft.com/office/drawing/2016/5/11/chartex" xmlns:cx6="http://schemas.microsoft.com/office/drawing/2016/5/12/chartex" xmlns:cx7="http://schemas.microsoft.com/office/drawing/2016/5/13/chartex" xmlns:cx8="http://schemas.microsoft.com/office/drawing/2016/5/14/chartex" xmlns:mc="http://schemas.openxmlformats.org/markup-compatibility/2006" xmlns:aink="http://schemas.microsoft.com/office/drawing/2016/ink" xmlns:am3d="http://schemas.microsoft.com/office/drawing/2017/model3d" xmlns:o="urn:schemas-microsoft-com:office:office" xmlns:oel="http://schemas.microsoft.com/office/2019/extlst" xmlns:r="http://schemas.openxmlformats.org/officeDocument/2006/relationships" xmlns:m="http://schemas.openxmlformats.org/officeDocument/2006/math" xmlns:v="urn:schemas-microsoft-com:vml" xmlns:wp14="http://schemas.microsoft.com/office/word/2010/wordprocessingDrawing" xmlns:wp="http://schemas.openxmlformats.org/drawingml/2006/wordprocessingDrawing" xmlns:w10="urn:schemas-microsoft-com:office:word" xmlns:w="http://schemas.openxmlformats.org/wordprocessingml/2006/main" xmlns:w14="http://schemas.microsoft.com/office/word/2010/wordml" xmlns:w15="http://schemas.microsoft.com/office/word/2012/wordml" xmlns:w16cex="http://schemas.microsoft.com/office/word/2018/wordml/cex" xmlns:w16cid="http://schemas.microsoft.com/office/word/2016/wordml/cid" xmlns:w16="http://schemas.microsoft.com/office/word/2018/wordml" xmlns:w16du="http://schemas.microsoft.com/office/word/2023/wordml/word16du" xmlns:w16sdtdh="http://schemas.microsoft.com/office/word/2020/wordml/sdtdatahash" xmlns:w16sdtfl="http://schemas.microsoft.com/office/word/2024/wordml/sdtformatlock" xmlns:w16se="http://schemas.microsoft.com/office/word/2015/wordml/symex" xmlns:wpg="http://schemas.microsoft.com/office/word/2010/wordprocessingGroup" xmlns:wpi="http://schemas.microsoft.com/office/word/2010/wordprocessingInk" xmlns:wne="http://schemas.microsoft.com/office/word/2006/wordml" xmlns:wps="http://schemas.microsoft.com/office/word/2010/wordprocessingShape" mc:Ignorable="w14 w15 w16se w16cid w16 w16cex w16sdtdh w16sdtfl w16du wp14">
   <w:p>
     <w:pPr>
-      <w:pStyle w:val="Encabezado"/>
+      <w:pStyle w:val="Header"/>
       <w:pBdr>
         <w:bottom w:val="thickThinSmallGap" w:sz="24" w:space="1" w:color="585858" w:themeColor="accent2" w:themeShade="7F"/>
       </w:pBdr>
@@ -20798,7 +20870,7 @@
     <w:lvl w:ilvl="0">
       <w:start w:val="1"/>
       <w:numFmt w:val="decimal"/>
-      <w:pStyle w:val="Ttulo1"/>
+      <w:pStyle w:val="Heading1"/>
       <w:lvlText w:val="Capítulo %1."/>
       <w:lvlJc w:val="left"/>
       <w:pPr>
@@ -20811,7 +20883,7 @@
     <w:lvl w:ilvl="1">
       <w:start w:val="1"/>
       <w:numFmt w:val="decimal"/>
-      <w:pStyle w:val="Ttulo2"/>
+      <w:pStyle w:val="Heading2"/>
       <w:lvlText w:val="%1.%2"/>
       <w:lvlJc w:val="left"/>
       <w:pPr>
@@ -20821,7 +20893,7 @@
     <w:lvl w:ilvl="2">
       <w:start w:val="1"/>
       <w:numFmt w:val="decimal"/>
-      <w:pStyle w:val="Ttulo3"/>
+      <w:pStyle w:val="Heading3"/>
       <w:lvlText w:val="%1.%2.%3"/>
       <w:lvlJc w:val="left"/>
       <w:pPr>
@@ -20831,7 +20903,7 @@
     <w:lvl w:ilvl="3">
       <w:start w:val="1"/>
       <w:numFmt w:val="decimal"/>
-      <w:pStyle w:val="Ttulo4"/>
+      <w:pStyle w:val="Heading4"/>
       <w:lvlText w:val="%1.%2.%3.%4"/>
       <w:lvlJc w:val="left"/>
       <w:pPr>
@@ -20841,7 +20913,7 @@
     <w:lvl w:ilvl="4">
       <w:start w:val="1"/>
       <w:numFmt w:val="decimal"/>
-      <w:pStyle w:val="Ttulo5"/>
+      <w:pStyle w:val="Heading5"/>
       <w:lvlText w:val="%1.%2.%3.%4.%5"/>
       <w:lvlJc w:val="left"/>
       <w:pPr>
@@ -20851,7 +20923,7 @@
     <w:lvl w:ilvl="5">
       <w:start w:val="1"/>
       <w:numFmt w:val="decimal"/>
-      <w:pStyle w:val="Ttulo6"/>
+      <w:pStyle w:val="Heading6"/>
       <w:lvlText w:val="%1.%2.%3.%4.%5.%6"/>
       <w:lvlJc w:val="left"/>
       <w:pPr>
@@ -20861,7 +20933,7 @@
     <w:lvl w:ilvl="6">
       <w:start w:val="1"/>
       <w:numFmt w:val="decimal"/>
-      <w:pStyle w:val="Ttulo7"/>
+      <w:pStyle w:val="Heading7"/>
       <w:lvlText w:val="%1.%2.%3.%4.%5.%6.%7"/>
       <w:lvlJc w:val="left"/>
       <w:pPr>
@@ -20871,7 +20943,7 @@
     <w:lvl w:ilvl="7">
       <w:start w:val="1"/>
       <w:numFmt w:val="decimal"/>
-      <w:pStyle w:val="Ttulo8"/>
+      <w:pStyle w:val="Heading8"/>
       <w:lvlText w:val="%1.%2.%3.%4.%5.%6.%7.%8"/>
       <w:lvlJc w:val="left"/>
       <w:pPr>
@@ -20881,7 +20953,7 @@
     <w:lvl w:ilvl="8">
       <w:start w:val="1"/>
       <w:numFmt w:val="decimal"/>
-      <w:pStyle w:val="Ttulo9"/>
+      <w:pStyle w:val="Heading9"/>
       <w:lvlText w:val="%1.%2.%3.%4.%5.%6.%7.%8.%9"/>
       <w:lvlJc w:val="left"/>
       <w:pPr>
@@ -21772,11 +21844,11 @@
       <w:jc w:val="both"/>
     </w:pPr>
   </w:style>
-  <w:style w:type="paragraph" w:styleId="Ttulo1">
+  <w:style w:type="paragraph" w:styleId="Heading1">
     <w:name w:val="heading 1"/>
     <w:basedOn w:val="Normal"/>
     <w:next w:val="Normal"/>
-    <w:link w:val="Ttulo1Car"/>
+    <w:link w:val="Heading1Char"/>
     <w:uiPriority w:val="9"/>
     <w:qFormat/>
     <w:rsid w:val="00DE44F9"/>
@@ -21798,11 +21870,11 @@
       <w:szCs w:val="28"/>
     </w:rPr>
   </w:style>
-  <w:style w:type="paragraph" w:styleId="Ttulo2">
+  <w:style w:type="paragraph" w:styleId="Heading2">
     <w:name w:val="heading 2"/>
     <w:basedOn w:val="Normal"/>
     <w:next w:val="Normal"/>
-    <w:link w:val="Ttulo2Car"/>
+    <w:link w:val="Heading2Char"/>
     <w:uiPriority w:val="9"/>
     <w:unhideWhenUsed/>
     <w:qFormat/>
@@ -21823,11 +21895,11 @@
       <w:szCs w:val="26"/>
     </w:rPr>
   </w:style>
-  <w:style w:type="paragraph" w:styleId="Ttulo3">
+  <w:style w:type="paragraph" w:styleId="Heading3">
     <w:name w:val="heading 3"/>
     <w:basedOn w:val="Normal"/>
     <w:next w:val="Normal"/>
-    <w:link w:val="Ttulo3Car"/>
+    <w:link w:val="Heading3Char"/>
     <w:uiPriority w:val="9"/>
     <w:unhideWhenUsed/>
     <w:qFormat/>
@@ -21849,11 +21921,11 @@
       <w:sz w:val="36"/>
     </w:rPr>
   </w:style>
-  <w:style w:type="paragraph" w:styleId="Ttulo4">
+  <w:style w:type="paragraph" w:styleId="Heading4">
     <w:name w:val="heading 4"/>
     <w:basedOn w:val="Normal"/>
     <w:next w:val="Normal"/>
-    <w:link w:val="Ttulo4Car"/>
+    <w:link w:val="Heading4Char"/>
     <w:uiPriority w:val="9"/>
     <w:unhideWhenUsed/>
     <w:qFormat/>
@@ -21879,11 +21951,11 @@
       <w:sz w:val="28"/>
     </w:rPr>
   </w:style>
-  <w:style w:type="paragraph" w:styleId="Ttulo5">
+  <w:style w:type="paragraph" w:styleId="Heading5">
     <w:name w:val="heading 5"/>
     <w:basedOn w:val="Normal"/>
     <w:next w:val="Normal"/>
-    <w:link w:val="Ttulo5Car"/>
+    <w:link w:val="Heading5Char"/>
     <w:uiPriority w:val="9"/>
     <w:unhideWhenUsed/>
     <w:qFormat/>
@@ -21906,11 +21978,11 @@
       <w:sz w:val="24"/>
     </w:rPr>
   </w:style>
-  <w:style w:type="paragraph" w:styleId="Ttulo6">
+  <w:style w:type="paragraph" w:styleId="Heading6">
     <w:name w:val="heading 6"/>
     <w:basedOn w:val="Normal"/>
     <w:next w:val="Normal"/>
-    <w:link w:val="Ttulo6Car"/>
+    <w:link w:val="Heading6Char"/>
     <w:uiPriority w:val="9"/>
     <w:unhideWhenUsed/>
     <w:qFormat/>
@@ -21932,11 +22004,11 @@
       <w:color w:val="6E6E6E" w:themeColor="accent1" w:themeShade="7F"/>
     </w:rPr>
   </w:style>
-  <w:style w:type="paragraph" w:styleId="Ttulo7">
+  <w:style w:type="paragraph" w:styleId="Heading7">
     <w:name w:val="heading 7"/>
     <w:basedOn w:val="Normal"/>
     <w:next w:val="Normal"/>
-    <w:link w:val="Ttulo7Car"/>
+    <w:link w:val="Heading7Char"/>
     <w:uiPriority w:val="9"/>
     <w:semiHidden/>
     <w:unhideWhenUsed/>
@@ -21959,11 +22031,11 @@
       <w:color w:val="404040" w:themeColor="text1" w:themeTint="BF"/>
     </w:rPr>
   </w:style>
-  <w:style w:type="paragraph" w:styleId="Ttulo8">
+  <w:style w:type="paragraph" w:styleId="Heading8">
     <w:name w:val="heading 8"/>
     <w:basedOn w:val="Normal"/>
     <w:next w:val="Normal"/>
-    <w:link w:val="Ttulo8Car"/>
+    <w:link w:val="Heading8Char"/>
     <w:uiPriority w:val="9"/>
     <w:semiHidden/>
     <w:unhideWhenUsed/>
@@ -21986,11 +22058,11 @@
       <w:szCs w:val="20"/>
     </w:rPr>
   </w:style>
-  <w:style w:type="paragraph" w:styleId="Ttulo9">
+  <w:style w:type="paragraph" w:styleId="Heading9">
     <w:name w:val="heading 9"/>
     <w:basedOn w:val="Normal"/>
     <w:next w:val="Normal"/>
-    <w:link w:val="Ttulo9Car"/>
+    <w:link w:val="Heading9Char"/>
     <w:uiPriority w:val="9"/>
     <w:semiHidden/>
     <w:unhideWhenUsed/>
@@ -22015,13 +22087,13 @@
       <w:szCs w:val="20"/>
     </w:rPr>
   </w:style>
-  <w:style w:type="character" w:default="1" w:styleId="Fuentedeprrafopredeter">
+  <w:style w:type="character" w:default="1" w:styleId="DefaultParagraphFont">
     <w:name w:val="Default Paragraph Font"/>
     <w:uiPriority w:val="1"/>
     <w:semiHidden/>
     <w:unhideWhenUsed/>
   </w:style>
-  <w:style w:type="table" w:default="1" w:styleId="Tablanormal">
+  <w:style w:type="table" w:default="1" w:styleId="TableNormal">
     <w:name w:val="Normal Table"/>
     <w:uiPriority w:val="99"/>
     <w:semiHidden/>
@@ -22036,17 +22108,17 @@
       </w:tblCellMar>
     </w:tblPr>
   </w:style>
-  <w:style w:type="numbering" w:default="1" w:styleId="Sinlista">
+  <w:style w:type="numbering" w:default="1" w:styleId="NoList">
     <w:name w:val="No List"/>
     <w:uiPriority w:val="99"/>
     <w:semiHidden/>
     <w:unhideWhenUsed/>
   </w:style>
-  <w:style w:type="paragraph" w:styleId="Ttulo">
+  <w:style w:type="paragraph" w:styleId="Title">
     <w:name w:val="Title"/>
     <w:basedOn w:val="Normal"/>
     <w:next w:val="Normal"/>
-    <w:link w:val="TtuloCar"/>
+    <w:link w:val="TitleChar"/>
     <w:uiPriority w:val="10"/>
     <w:qFormat/>
     <w:rsid w:val="00B46E83"/>
@@ -22066,10 +22138,10 @@
       <w:szCs w:val="52"/>
     </w:rPr>
   </w:style>
-  <w:style w:type="character" w:customStyle="1" w:styleId="TtuloCar">
-    <w:name w:val="Título Car"/>
-    <w:basedOn w:val="Fuentedeprrafopredeter"/>
-    <w:link w:val="Ttulo"/>
+  <w:style w:type="character" w:customStyle="1" w:styleId="TitleChar">
+    <w:name w:val="Title Char"/>
+    <w:basedOn w:val="DefaultParagraphFont"/>
+    <w:link w:val="Title"/>
     <w:uiPriority w:val="10"/>
     <w:rsid w:val="00B46E83"/>
     <w:rPr>
@@ -22081,10 +22153,10 @@
       <w:szCs w:val="52"/>
     </w:rPr>
   </w:style>
-  <w:style w:type="paragraph" w:styleId="Textonotapie">
+  <w:style w:type="paragraph" w:styleId="FootnoteText">
     <w:name w:val="footnote text"/>
     <w:basedOn w:val="Normal"/>
-    <w:link w:val="TextonotapieCar"/>
+    <w:link w:val="FootnoteTextChar"/>
     <w:uiPriority w:val="99"/>
     <w:semiHidden/>
     <w:unhideWhenUsed/>
@@ -22097,10 +22169,10 @@
       <w:szCs w:val="20"/>
     </w:rPr>
   </w:style>
-  <w:style w:type="character" w:customStyle="1" w:styleId="TextonotapieCar">
-    <w:name w:val="Texto nota pie Car"/>
-    <w:basedOn w:val="Fuentedeprrafopredeter"/>
-    <w:link w:val="Textonotapie"/>
+  <w:style w:type="character" w:customStyle="1" w:styleId="FootnoteTextChar">
+    <w:name w:val="Footnote Text Char"/>
+    <w:basedOn w:val="DefaultParagraphFont"/>
+    <w:link w:val="FootnoteText"/>
     <w:uiPriority w:val="99"/>
     <w:semiHidden/>
     <w:rsid w:val="00B07406"/>
@@ -22109,9 +22181,9 @@
       <w:szCs w:val="20"/>
     </w:rPr>
   </w:style>
-  <w:style w:type="character" w:styleId="Refdenotaalpie">
+  <w:style w:type="character" w:styleId="FootnoteReference">
     <w:name w:val="footnote reference"/>
-    <w:basedOn w:val="Fuentedeprrafopredeter"/>
+    <w:basedOn w:val="DefaultParagraphFont"/>
     <w:uiPriority w:val="99"/>
     <w:semiHidden/>
     <w:unhideWhenUsed/>
@@ -22120,10 +22192,10 @@
       <w:vertAlign w:val="superscript"/>
     </w:rPr>
   </w:style>
-  <w:style w:type="character" w:customStyle="1" w:styleId="Ttulo1Car">
-    <w:name w:val="Título 1 Car"/>
-    <w:basedOn w:val="Fuentedeprrafopredeter"/>
-    <w:link w:val="Ttulo1"/>
+  <w:style w:type="character" w:customStyle="1" w:styleId="Heading1Char">
+    <w:name w:val="Heading 1 Char"/>
+    <w:basedOn w:val="DefaultParagraphFont"/>
+    <w:link w:val="Heading1"/>
     <w:uiPriority w:val="9"/>
     <w:rsid w:val="00DE44F9"/>
     <w:rPr>
@@ -22135,9 +22207,9 @@
       <w:szCs w:val="28"/>
     </w:rPr>
   </w:style>
-  <w:style w:type="paragraph" w:styleId="TtuloTDC">
+  <w:style w:type="paragraph" w:styleId="TOCHeading">
     <w:name w:val="TOC Heading"/>
-    <w:basedOn w:val="Ttulo1"/>
+    <w:basedOn w:val="Heading1"/>
     <w:next w:val="Normal"/>
     <w:uiPriority w:val="39"/>
     <w:semiHidden/>
@@ -22149,7 +22221,7 @@
       <w:outlineLvl w:val="9"/>
     </w:pPr>
   </w:style>
-  <w:style w:type="paragraph" w:styleId="TDC2">
+  <w:style w:type="paragraph" w:styleId="TOC2">
     <w:name w:val="toc 2"/>
     <w:basedOn w:val="Normal"/>
     <w:next w:val="Normal"/>
@@ -22173,7 +22245,7 @@
       <w:szCs w:val="20"/>
     </w:rPr>
   </w:style>
-  <w:style w:type="paragraph" w:styleId="TDC1">
+  <w:style w:type="paragraph" w:styleId="TOC1">
     <w:name w:val="toc 1"/>
     <w:basedOn w:val="Normal"/>
     <w:next w:val="Normal"/>
@@ -22194,7 +22266,7 @@
       <w:szCs w:val="20"/>
     </w:rPr>
   </w:style>
-  <w:style w:type="paragraph" w:styleId="TDC3">
+  <w:style w:type="paragraph" w:styleId="TOC3">
     <w:name w:val="toc 3"/>
     <w:basedOn w:val="Normal"/>
     <w:next w:val="Normal"/>
@@ -22215,10 +22287,10 @@
       <w:szCs w:val="20"/>
     </w:rPr>
   </w:style>
-  <w:style w:type="paragraph" w:styleId="Textodeglobo">
+  <w:style w:type="paragraph" w:styleId="BalloonText">
     <w:name w:val="Balloon Text"/>
     <w:basedOn w:val="Normal"/>
-    <w:link w:val="TextodegloboCar"/>
+    <w:link w:val="BalloonTextChar"/>
     <w:uiPriority w:val="99"/>
     <w:semiHidden/>
     <w:unhideWhenUsed/>
@@ -22232,10 +22304,10 @@
       <w:szCs w:val="16"/>
     </w:rPr>
   </w:style>
-  <w:style w:type="character" w:customStyle="1" w:styleId="TextodegloboCar">
-    <w:name w:val="Texto de globo Car"/>
-    <w:basedOn w:val="Fuentedeprrafopredeter"/>
-    <w:link w:val="Textodeglobo"/>
+  <w:style w:type="character" w:customStyle="1" w:styleId="BalloonTextChar">
+    <w:name w:val="Balloon Text Char"/>
+    <w:basedOn w:val="DefaultParagraphFont"/>
+    <w:link w:val="BalloonText"/>
     <w:uiPriority w:val="99"/>
     <w:semiHidden/>
     <w:rsid w:val="007C3483"/>
@@ -22245,7 +22317,7 @@
       <w:szCs w:val="16"/>
     </w:rPr>
   </w:style>
-  <w:style w:type="paragraph" w:styleId="TDC4">
+  <w:style w:type="paragraph" w:styleId="TOC4">
     <w:name w:val="toc 4"/>
     <w:basedOn w:val="Normal"/>
     <w:next w:val="Normal"/>
@@ -22263,7 +22335,7 @@
       <w:szCs w:val="18"/>
     </w:rPr>
   </w:style>
-  <w:style w:type="paragraph" w:styleId="TDC5">
+  <w:style w:type="paragraph" w:styleId="TOC5">
     <w:name w:val="toc 5"/>
     <w:basedOn w:val="Normal"/>
     <w:next w:val="Normal"/>
@@ -22281,7 +22353,7 @@
       <w:szCs w:val="18"/>
     </w:rPr>
   </w:style>
-  <w:style w:type="paragraph" w:styleId="TDC6">
+  <w:style w:type="paragraph" w:styleId="TOC6">
     <w:name w:val="toc 6"/>
     <w:basedOn w:val="Normal"/>
     <w:next w:val="Normal"/>
@@ -22299,7 +22371,7 @@
       <w:szCs w:val="18"/>
     </w:rPr>
   </w:style>
-  <w:style w:type="paragraph" w:styleId="TDC7">
+  <w:style w:type="paragraph" w:styleId="TOC7">
     <w:name w:val="toc 7"/>
     <w:basedOn w:val="Normal"/>
     <w:next w:val="Normal"/>
@@ -22317,7 +22389,7 @@
       <w:szCs w:val="18"/>
     </w:rPr>
   </w:style>
-  <w:style w:type="paragraph" w:styleId="TDC8">
+  <w:style w:type="paragraph" w:styleId="TOC8">
     <w:name w:val="toc 8"/>
     <w:basedOn w:val="Normal"/>
     <w:next w:val="Normal"/>
@@ -22335,7 +22407,7 @@
       <w:szCs w:val="18"/>
     </w:rPr>
   </w:style>
-  <w:style w:type="paragraph" w:styleId="TDC9">
+  <w:style w:type="paragraph" w:styleId="TOC9">
     <w:name w:val="toc 9"/>
     <w:basedOn w:val="Normal"/>
     <w:next w:val="Normal"/>
@@ -22353,7 +22425,7 @@
       <w:szCs w:val="18"/>
     </w:rPr>
   </w:style>
-  <w:style w:type="paragraph" w:styleId="Tabladeilustraciones">
+  <w:style w:type="paragraph" w:styleId="TableofFigures">
     <w:name w:val="table of figures"/>
     <w:basedOn w:val="Normal"/>
     <w:next w:val="Normal"/>
@@ -22372,10 +22444,10 @@
       <w:szCs w:val="20"/>
     </w:rPr>
   </w:style>
-  <w:style w:type="paragraph" w:styleId="Encabezado">
+  <w:style w:type="paragraph" w:styleId="Header">
     <w:name w:val="header"/>
     <w:basedOn w:val="Normal"/>
-    <w:link w:val="EncabezadoCar"/>
+    <w:link w:val="HeaderChar"/>
     <w:uiPriority w:val="99"/>
     <w:unhideWhenUsed/>
     <w:rsid w:val="00571D5D"/>
@@ -22387,17 +22459,17 @@
       <w:spacing w:after="0" w:line="240" w:lineRule="auto"/>
     </w:pPr>
   </w:style>
-  <w:style w:type="character" w:customStyle="1" w:styleId="EncabezadoCar">
-    <w:name w:val="Encabezado Car"/>
-    <w:basedOn w:val="Fuentedeprrafopredeter"/>
-    <w:link w:val="Encabezado"/>
+  <w:style w:type="character" w:customStyle="1" w:styleId="HeaderChar">
+    <w:name w:val="Header Char"/>
+    <w:basedOn w:val="DefaultParagraphFont"/>
+    <w:link w:val="Header"/>
     <w:uiPriority w:val="99"/>
     <w:rsid w:val="00571D5D"/>
   </w:style>
-  <w:style w:type="paragraph" w:styleId="Piedepgina">
+  <w:style w:type="paragraph" w:styleId="Footer">
     <w:name w:val="footer"/>
     <w:basedOn w:val="Normal"/>
-    <w:link w:val="PiedepginaCar"/>
+    <w:link w:val="FooterChar"/>
     <w:uiPriority w:val="99"/>
     <w:unhideWhenUsed/>
     <w:rsid w:val="00571D5D"/>
@@ -22409,16 +22481,16 @@
       <w:spacing w:after="0" w:line="240" w:lineRule="auto"/>
     </w:pPr>
   </w:style>
-  <w:style w:type="character" w:customStyle="1" w:styleId="PiedepginaCar">
-    <w:name w:val="Pie de página Car"/>
-    <w:basedOn w:val="Fuentedeprrafopredeter"/>
-    <w:link w:val="Piedepgina"/>
+  <w:style w:type="character" w:customStyle="1" w:styleId="FooterChar">
+    <w:name w:val="Footer Char"/>
+    <w:basedOn w:val="DefaultParagraphFont"/>
+    <w:link w:val="Footer"/>
     <w:uiPriority w:val="99"/>
     <w:rsid w:val="00571D5D"/>
   </w:style>
-  <w:style w:type="character" w:styleId="Textodelmarcadordeposicin">
+  <w:style w:type="character" w:styleId="PlaceholderText">
     <w:name w:val="Placeholder Text"/>
-    <w:basedOn w:val="Fuentedeprrafopredeter"/>
+    <w:basedOn w:val="DefaultParagraphFont"/>
     <w:uiPriority w:val="99"/>
     <w:semiHidden/>
     <w:rsid w:val="0056742A"/>
@@ -22426,9 +22498,9 @@
       <w:color w:val="808080"/>
     </w:rPr>
   </w:style>
-  <w:style w:type="character" w:styleId="Hipervnculo">
+  <w:style w:type="character" w:styleId="Hyperlink">
     <w:name w:val="Hyperlink"/>
-    <w:basedOn w:val="Fuentedeprrafopredeter"/>
+    <w:basedOn w:val="DefaultParagraphFont"/>
     <w:uiPriority w:val="99"/>
     <w:unhideWhenUsed/>
     <w:rsid w:val="00B272D4"/>
@@ -22437,10 +22509,10 @@
       <w:u w:val="single"/>
     </w:rPr>
   </w:style>
-  <w:style w:type="character" w:customStyle="1" w:styleId="Ttulo2Car">
-    <w:name w:val="Título 2 Car"/>
-    <w:basedOn w:val="Fuentedeprrafopredeter"/>
-    <w:link w:val="Ttulo2"/>
+  <w:style w:type="character" w:customStyle="1" w:styleId="Heading2Char">
+    <w:name w:val="Heading 2 Char"/>
+    <w:basedOn w:val="DefaultParagraphFont"/>
+    <w:link w:val="Heading2"/>
     <w:uiPriority w:val="9"/>
     <w:rsid w:val="008A6017"/>
     <w:rPr>
@@ -22451,10 +22523,10 @@
       <w:szCs w:val="26"/>
     </w:rPr>
   </w:style>
-  <w:style w:type="character" w:customStyle="1" w:styleId="Ttulo3Car">
-    <w:name w:val="Título 3 Car"/>
-    <w:basedOn w:val="Fuentedeprrafopredeter"/>
-    <w:link w:val="Ttulo3"/>
+  <w:style w:type="character" w:customStyle="1" w:styleId="Heading3Char">
+    <w:name w:val="Heading 3 Char"/>
+    <w:basedOn w:val="DefaultParagraphFont"/>
+    <w:link w:val="Heading3"/>
     <w:uiPriority w:val="9"/>
     <w:rsid w:val="008A6017"/>
     <w:rPr>
@@ -22464,10 +22536,10 @@
       <w:sz w:val="36"/>
     </w:rPr>
   </w:style>
-  <w:style w:type="character" w:customStyle="1" w:styleId="Ttulo4Car">
-    <w:name w:val="Título 4 Car"/>
-    <w:basedOn w:val="Fuentedeprrafopredeter"/>
-    <w:link w:val="Ttulo4"/>
+  <w:style w:type="character" w:customStyle="1" w:styleId="Heading4Char">
+    <w:name w:val="Heading 4 Char"/>
+    <w:basedOn w:val="DefaultParagraphFont"/>
+    <w:link w:val="Heading4"/>
     <w:uiPriority w:val="9"/>
     <w:rsid w:val="00E47FF7"/>
     <w:rPr>
@@ -22480,10 +22552,10 @@
       <w:sz w:val="28"/>
     </w:rPr>
   </w:style>
-  <w:style w:type="character" w:customStyle="1" w:styleId="Ttulo5Car">
-    <w:name w:val="Título 5 Car"/>
-    <w:basedOn w:val="Fuentedeprrafopredeter"/>
-    <w:link w:val="Ttulo5"/>
+  <w:style w:type="character" w:customStyle="1" w:styleId="Heading5Char">
+    <w:name w:val="Heading 5 Char"/>
+    <w:basedOn w:val="DefaultParagraphFont"/>
+    <w:link w:val="Heading5"/>
     <w:uiPriority w:val="9"/>
     <w:rsid w:val="005C29E5"/>
     <w:rPr>
@@ -22493,10 +22565,10 @@
       <w:sz w:val="24"/>
     </w:rPr>
   </w:style>
-  <w:style w:type="character" w:customStyle="1" w:styleId="Ttulo6Car">
-    <w:name w:val="Título 6 Car"/>
-    <w:basedOn w:val="Fuentedeprrafopredeter"/>
-    <w:link w:val="Ttulo6"/>
+  <w:style w:type="character" w:customStyle="1" w:styleId="Heading6Char">
+    <w:name w:val="Heading 6 Char"/>
+    <w:basedOn w:val="DefaultParagraphFont"/>
+    <w:link w:val="Heading6"/>
     <w:uiPriority w:val="9"/>
     <w:rsid w:val="008A6017"/>
     <w:rPr>
@@ -22506,10 +22578,10 @@
       <w:color w:val="6E6E6E" w:themeColor="accent1" w:themeShade="7F"/>
     </w:rPr>
   </w:style>
-  <w:style w:type="character" w:customStyle="1" w:styleId="Ttulo7Car">
-    <w:name w:val="Título 7 Car"/>
-    <w:basedOn w:val="Fuentedeprrafopredeter"/>
-    <w:link w:val="Ttulo7"/>
+  <w:style w:type="character" w:customStyle="1" w:styleId="Heading7Char">
+    <w:name w:val="Heading 7 Char"/>
+    <w:basedOn w:val="DefaultParagraphFont"/>
+    <w:link w:val="Heading7"/>
     <w:uiPriority w:val="9"/>
     <w:semiHidden/>
     <w:rsid w:val="008A6017"/>
@@ -22520,10 +22592,10 @@
       <w:color w:val="404040" w:themeColor="text1" w:themeTint="BF"/>
     </w:rPr>
   </w:style>
-  <w:style w:type="character" w:customStyle="1" w:styleId="Ttulo8Car">
-    <w:name w:val="Título 8 Car"/>
-    <w:basedOn w:val="Fuentedeprrafopredeter"/>
-    <w:link w:val="Ttulo8"/>
+  <w:style w:type="character" w:customStyle="1" w:styleId="Heading8Char">
+    <w:name w:val="Heading 8 Char"/>
+    <w:basedOn w:val="DefaultParagraphFont"/>
+    <w:link w:val="Heading8"/>
     <w:uiPriority w:val="9"/>
     <w:semiHidden/>
     <w:rsid w:val="008A6017"/>
@@ -22534,10 +22606,10 @@
       <w:szCs w:val="20"/>
     </w:rPr>
   </w:style>
-  <w:style w:type="character" w:customStyle="1" w:styleId="Ttulo9Car">
-    <w:name w:val="Título 9 Car"/>
-    <w:basedOn w:val="Fuentedeprrafopredeter"/>
-    <w:link w:val="Ttulo9"/>
+  <w:style w:type="character" w:customStyle="1" w:styleId="Heading9Char">
+    <w:name w:val="Heading 9 Char"/>
+    <w:basedOn w:val="DefaultParagraphFont"/>
+    <w:link w:val="Heading9"/>
     <w:uiPriority w:val="9"/>
     <w:semiHidden/>
     <w:rsid w:val="008A6017"/>
@@ -22550,7 +22622,7 @@
       <w:szCs w:val="20"/>
     </w:rPr>
   </w:style>
-  <w:style w:type="paragraph" w:styleId="Descripcin">
+  <w:style w:type="paragraph" w:styleId="Caption">
     <w:name w:val="caption"/>
     <w:basedOn w:val="Normal"/>
     <w:next w:val="Normal"/>
@@ -22570,7 +22642,7 @@
       <w:szCs w:val="18"/>
     </w:rPr>
   </w:style>
-  <w:style w:type="paragraph" w:styleId="Prrafodelista">
+  <w:style w:type="paragraph" w:styleId="ListParagraph">
     <w:name w:val="List Paragraph"/>
     <w:basedOn w:val="Normal"/>
     <w:uiPriority w:val="34"/>
@@ -22582,9 +22654,9 @@
       <w:contextualSpacing/>
     </w:pPr>
   </w:style>
-  <w:style w:type="table" w:styleId="Tablaconcuadrcula">
+  <w:style w:type="table" w:styleId="TableGrid">
     <w:name w:val="Table Grid"/>
-    <w:basedOn w:val="Tablanormal"/>
+    <w:basedOn w:val="TableNormal"/>
     <w:uiPriority w:val="59"/>
     <w:rsid w:val="003F74B0"/>
     <w:pPr>
@@ -22601,7 +22673,7 @@
       </w:tblBorders>
     </w:tblPr>
   </w:style>
-  <w:style w:type="paragraph" w:styleId="ndice1">
+  <w:style w:type="paragraph" w:styleId="Index1">
     <w:name w:val="index 1"/>
     <w:basedOn w:val="Normal"/>
     <w:next w:val="Normal"/>
@@ -22619,7 +22691,7 @@
       <w:szCs w:val="18"/>
     </w:rPr>
   </w:style>
-  <w:style w:type="paragraph" w:styleId="ndice2">
+  <w:style w:type="paragraph" w:styleId="Index2">
     <w:name w:val="index 2"/>
     <w:basedOn w:val="Normal"/>
     <w:next w:val="Normal"/>
@@ -22637,7 +22709,7 @@
       <w:szCs w:val="18"/>
     </w:rPr>
   </w:style>
-  <w:style w:type="paragraph" w:styleId="ndice3">
+  <w:style w:type="paragraph" w:styleId="Index3">
     <w:name w:val="index 3"/>
     <w:basedOn w:val="Normal"/>
     <w:next w:val="Normal"/>
@@ -22655,7 +22727,7 @@
       <w:szCs w:val="18"/>
     </w:rPr>
   </w:style>
-  <w:style w:type="paragraph" w:styleId="ndice4">
+  <w:style w:type="paragraph" w:styleId="Index4">
     <w:name w:val="index 4"/>
     <w:basedOn w:val="Normal"/>
     <w:next w:val="Normal"/>
@@ -22673,7 +22745,7 @@
       <w:szCs w:val="18"/>
     </w:rPr>
   </w:style>
-  <w:style w:type="paragraph" w:styleId="ndice5">
+  <w:style w:type="paragraph" w:styleId="Index5">
     <w:name w:val="index 5"/>
     <w:basedOn w:val="Normal"/>
     <w:next w:val="Normal"/>
@@ -22691,7 +22763,7 @@
       <w:szCs w:val="18"/>
     </w:rPr>
   </w:style>
-  <w:style w:type="paragraph" w:styleId="ndice6">
+  <w:style w:type="paragraph" w:styleId="Index6">
     <w:name w:val="index 6"/>
     <w:basedOn w:val="Normal"/>
     <w:next w:val="Normal"/>
@@ -22709,7 +22781,7 @@
       <w:szCs w:val="18"/>
     </w:rPr>
   </w:style>
-  <w:style w:type="paragraph" w:styleId="ndice7">
+  <w:style w:type="paragraph" w:styleId="Index7">
     <w:name w:val="index 7"/>
     <w:basedOn w:val="Normal"/>
     <w:next w:val="Normal"/>
@@ -22727,7 +22799,7 @@
       <w:szCs w:val="18"/>
     </w:rPr>
   </w:style>
-  <w:style w:type="paragraph" w:styleId="ndice8">
+  <w:style w:type="paragraph" w:styleId="Index8">
     <w:name w:val="index 8"/>
     <w:basedOn w:val="Normal"/>
     <w:next w:val="Normal"/>
@@ -22745,7 +22817,7 @@
       <w:szCs w:val="18"/>
     </w:rPr>
   </w:style>
-  <w:style w:type="paragraph" w:styleId="ndice9">
+  <w:style w:type="paragraph" w:styleId="Index9">
     <w:name w:val="index 9"/>
     <w:basedOn w:val="Normal"/>
     <w:next w:val="Normal"/>
@@ -22763,10 +22835,10 @@
       <w:szCs w:val="18"/>
     </w:rPr>
   </w:style>
-  <w:style w:type="paragraph" w:styleId="Ttulodendice">
+  <w:style w:type="paragraph" w:styleId="IndexHeading">
     <w:name w:val="index heading"/>
     <w:basedOn w:val="Normal"/>
-    <w:next w:val="ndice1"/>
+    <w:next w:val="Index1"/>
     <w:uiPriority w:val="99"/>
     <w:unhideWhenUsed/>
     <w:rsid w:val="00C12E10"/>
@@ -22826,9 +22898,9 @@
       <w:lang w:eastAsia="es-ES"/>
     </w:rPr>
   </w:style>
-  <w:style w:type="character" w:styleId="nfasis">
+  <w:style w:type="character" w:styleId="Emphasis">
     <w:name w:val="Emphasis"/>
-    <w:basedOn w:val="Fuentedeprrafopredeter"/>
+    <w:basedOn w:val="DefaultParagraphFont"/>
     <w:uiPriority w:val="20"/>
     <w:qFormat/>
     <w:rsid w:val="00EE256C"/>
@@ -22837,9 +22909,9 @@
       <w:iCs/>
     </w:rPr>
   </w:style>
-  <w:style w:type="character" w:styleId="Hipervnculovisitado">
+  <w:style w:type="character" w:styleId="FollowedHyperlink">
     <w:name w:val="FollowedHyperlink"/>
-    <w:basedOn w:val="Fuentedeprrafopredeter"/>
+    <w:basedOn w:val="DefaultParagraphFont"/>
     <w:uiPriority w:val="99"/>
     <w:semiHidden/>
     <w:unhideWhenUsed/>
@@ -22851,17 +22923,17 @@
   </w:style>
   <w:style w:type="character" w:customStyle="1" w:styleId="apple-style-span">
     <w:name w:val="apple-style-span"/>
-    <w:basedOn w:val="Fuentedeprrafopredeter"/>
+    <w:basedOn w:val="DefaultParagraphFont"/>
     <w:rsid w:val="00716004"/>
   </w:style>
   <w:style w:type="character" w:customStyle="1" w:styleId="apple-converted-space">
     <w:name w:val="apple-converted-space"/>
-    <w:basedOn w:val="Fuentedeprrafopredeter"/>
+    <w:basedOn w:val="DefaultParagraphFont"/>
     <w:rsid w:val="00716004"/>
   </w:style>
-  <w:style w:type="table" w:styleId="Sombreadomedio2-nfasis1">
+  <w:style w:type="table" w:styleId="MediumShading2-Accent1">
     <w:name w:val="Medium Shading 2 Accent 1"/>
-    <w:basedOn w:val="Tablanormal"/>
+    <w:basedOn w:val="TableNormal"/>
     <w:uiPriority w:val="64"/>
     <w:rsid w:val="00BE5814"/>
     <w:pPr>
@@ -23001,9 +23073,9 @@
       </w:tcPr>
     </w:tblStylePr>
   </w:style>
-  <w:style w:type="paragraph" w:styleId="Sinespaciado">
+  <w:style w:type="paragraph" w:styleId="NoSpacing">
     <w:name w:val="No Spacing"/>
-    <w:link w:val="SinespaciadoCar"/>
+    <w:link w:val="NoSpacingChar"/>
     <w:uiPriority w:val="1"/>
     <w:qFormat/>
     <w:rsid w:val="0015211F"/>
@@ -23014,19 +23086,19 @@
       <w:rFonts w:eastAsiaTheme="minorEastAsia"/>
     </w:rPr>
   </w:style>
-  <w:style w:type="character" w:customStyle="1" w:styleId="SinespaciadoCar">
-    <w:name w:val="Sin espaciado Car"/>
-    <w:basedOn w:val="Fuentedeprrafopredeter"/>
-    <w:link w:val="Sinespaciado"/>
+  <w:style w:type="character" w:customStyle="1" w:styleId="NoSpacingChar">
+    <w:name w:val="No Spacing Char"/>
+    <w:basedOn w:val="DefaultParagraphFont"/>
+    <w:link w:val="NoSpacing"/>
     <w:uiPriority w:val="1"/>
     <w:rsid w:val="0015211F"/>
     <w:rPr>
       <w:rFonts w:eastAsiaTheme="minorEastAsia"/>
     </w:rPr>
   </w:style>
-  <w:style w:type="character" w:styleId="Refdecomentario">
+  <w:style w:type="character" w:styleId="CommentReference">
     <w:name w:val="annotation reference"/>
-    <w:basedOn w:val="Fuentedeprrafopredeter"/>
+    <w:basedOn w:val="DefaultParagraphFont"/>
     <w:uiPriority w:val="99"/>
     <w:semiHidden/>
     <w:unhideWhenUsed/>
@@ -23036,10 +23108,10 @@
       <w:szCs w:val="16"/>
     </w:rPr>
   </w:style>
-  <w:style w:type="paragraph" w:styleId="Textocomentario">
+  <w:style w:type="paragraph" w:styleId="CommentText">
     <w:name w:val="annotation text"/>
     <w:basedOn w:val="Normal"/>
-    <w:link w:val="TextocomentarioCar"/>
+    <w:link w:val="CommentTextChar"/>
     <w:uiPriority w:val="99"/>
     <w:semiHidden/>
     <w:unhideWhenUsed/>
@@ -23052,10 +23124,10 @@
       <w:szCs w:val="20"/>
     </w:rPr>
   </w:style>
-  <w:style w:type="character" w:customStyle="1" w:styleId="TextocomentarioCar">
-    <w:name w:val="Texto comentario Car"/>
-    <w:basedOn w:val="Fuentedeprrafopredeter"/>
-    <w:link w:val="Textocomentario"/>
+  <w:style w:type="character" w:customStyle="1" w:styleId="CommentTextChar">
+    <w:name w:val="Comment Text Char"/>
+    <w:basedOn w:val="DefaultParagraphFont"/>
+    <w:link w:val="CommentText"/>
     <w:uiPriority w:val="99"/>
     <w:semiHidden/>
     <w:rsid w:val="000148E0"/>
@@ -23064,11 +23136,11 @@
       <w:szCs w:val="20"/>
     </w:rPr>
   </w:style>
-  <w:style w:type="paragraph" w:styleId="Asuntodelcomentario">
+  <w:style w:type="paragraph" w:styleId="CommentSubject">
     <w:name w:val="annotation subject"/>
-    <w:basedOn w:val="Textocomentario"/>
-    <w:next w:val="Textocomentario"/>
-    <w:link w:val="AsuntodelcomentarioCar"/>
+    <w:basedOn w:val="CommentText"/>
+    <w:next w:val="CommentText"/>
+    <w:link w:val="CommentSubjectChar"/>
     <w:uiPriority w:val="99"/>
     <w:semiHidden/>
     <w:unhideWhenUsed/>
@@ -23078,10 +23150,10 @@
       <w:bCs/>
     </w:rPr>
   </w:style>
-  <w:style w:type="character" w:customStyle="1" w:styleId="AsuntodelcomentarioCar">
-    <w:name w:val="Asunto del comentario Car"/>
-    <w:basedOn w:val="TextocomentarioCar"/>
-    <w:link w:val="Asuntodelcomentario"/>
+  <w:style w:type="character" w:customStyle="1" w:styleId="CommentSubjectChar">
+    <w:name w:val="Comment Subject Char"/>
+    <w:basedOn w:val="CommentTextChar"/>
+    <w:link w:val="CommentSubject"/>
     <w:uiPriority w:val="99"/>
     <w:semiHidden/>
     <w:rsid w:val="000148E0"/>
@@ -23108,9 +23180,9 @@
       <w:szCs w:val="24"/>
     </w:rPr>
   </w:style>
-  <w:style w:type="table" w:styleId="Tablaconcuadrculaclara">
+  <w:style w:type="table" w:styleId="TableGridLight">
     <w:name w:val="Grid Table Light"/>
-    <w:basedOn w:val="Tablanormal"/>
+    <w:basedOn w:val="TableNormal"/>
     <w:uiPriority w:val="40"/>
     <w:rsid w:val="00A046B9"/>
     <w:pPr>
@@ -23127,9 +23199,9 @@
       </w:tblBorders>
     </w:tblPr>
   </w:style>
-  <w:style w:type="character" w:styleId="Mencinsinresolver">
+  <w:style w:type="character" w:styleId="UnresolvedMention">
     <w:name w:val="Unresolved Mention"/>
-    <w:basedOn w:val="Fuentedeprrafopredeter"/>
+    <w:basedOn w:val="DefaultParagraphFont"/>
     <w:uiPriority w:val="99"/>
     <w:semiHidden/>
     <w:unhideWhenUsed/>
@@ -23153,8 +23225,8 @@
   </w:style>
   <w:style w:type="table" w:customStyle="1" w:styleId="Tablaconcuadrcula1">
     <w:name w:val="Tabla con cuadrícula1"/>
-    <w:basedOn w:val="Tablanormal"/>
-    <w:next w:val="Tablaconcuadrcula"/>
+    <w:basedOn w:val="TableNormal"/>
+    <w:next w:val="TableGrid"/>
     <w:uiPriority w:val="59"/>
     <w:rsid w:val="002C6F1E"/>
     <w:pPr>
@@ -23177,9 +23249,9 @@
       </w:tblBorders>
     </w:tblPr>
   </w:style>
-  <w:style w:type="character" w:styleId="Textoennegrita">
+  <w:style w:type="character" w:styleId="Strong">
     <w:name w:val="Strong"/>
-    <w:basedOn w:val="Fuentedeprrafopredeter"/>
+    <w:basedOn w:val="DefaultParagraphFont"/>
     <w:uiPriority w:val="22"/>
     <w:qFormat/>
     <w:rsid w:val="00211E8B"/>

</xml_diff>